<commit_message>
Close 29 Apr 2026 open trade at model exit (-185 pts) and refresh analysis and report
Co-Authored-By: Claude Sonnet 5.5 <noreply@anthropic.com>
Claude-Session: https://claude.ai/code/session_01NXDNZiScC3GTCLADanc7h1
</commit_message>
<xml_diff>
--- a/analysis/SSR_Live_Performance_Evaluation.docx
+++ b/analysis/SSR_Live_Performance_Evaluation.docx
@@ -119,7 +119,7 @@
           <w:sz w:val="21"/>
           <w:szCs w:val="21"/>
         </w:rPr>
-        <w:t xml:space="preserve">Live unhedged +1,044 pts (58/month), live with hedge +577 pts (32/month), SSR model +1,088 pts (61/month), versus a backtest average of 156 pts/month.</w:t>
+        <w:t xml:space="preserve">Live unhedged +898 pts (50/month), live with hedge +431 pts (24/month), SSR model +1,088 pts (61/month), versus a backtest average of 156 pts/month.</w:t>
       </w:r>
     </w:p>
     <w:p>
@@ -145,7 +145,7 @@
           <w:sz w:val="21"/>
           <w:szCs w:val="21"/>
         </w:rPr>
-        <w:t xml:space="preserve">Avg monthly points: 37% (unhedged) and 21% (hedged). Return / max drawdown: 0.73 and 0.50 versus 13.47, i.e. about 5% and 4%.</w:t>
+        <w:t xml:space="preserve">Avg monthly points: 32% (unhedged) and 15% (hedged). Return / max drawdown: 0.63 and 0.37 versus 13.47, i.e. about 5% and 3%.</w:t>
       </w:r>
     </w:p>
     <w:p>
@@ -197,7 +197,7 @@
           <w:sz w:val="21"/>
           <w:szCs w:val="21"/>
         </w:rPr>
-        <w:t xml:space="preserve">3 Feb 2026 produced a single-trade loss of -798 pts (backtest worst: -318). The hedge returned +221 pts that day, cutting the worst day to -576 pts. Excluding that one trade, unhedged live would show +1,842 pts (about 102/month, 65% of backtest rate).</w:t>
+        <w:t xml:space="preserve">3 Feb 2026 produced a single-trade loss of -798 pts (backtest worst: -318). The hedge returned +221 pts that day, cutting the worst day to -576 pts. Excluding that one trade, unhedged live would show +1,696 pts (about 94/month, 60% of the backtest rate).</w:t>
       </w:r>
     </w:p>
     <w:p>
@@ -223,7 +223,7 @@
           <w:sz w:val="21"/>
           <w:szCs w:val="21"/>
         </w:rPr>
-        <w:t xml:space="preserve">The hedge book made -467 pts in total (16% win rate on 256 legs); excluding 3 Feb it lost -689 pts. It reduced max drawdown by about 19% but lowered return / drawdown (0.73 to 0.50).</w:t>
+        <w:t xml:space="preserve">The hedge book made -467 pts in total (16% win rate on 256 legs); excluding 3 Feb it lost -689 pts. It reduced max drawdown by about 19% but lowered return / drawdown (0.63 to 0.37).</w:t>
       </w:r>
     </w:p>
     <w:p>
@@ -249,7 +249,7 @@
           <w:sz w:val="21"/>
           <w:szCs w:val="21"/>
         </w:rPr>
-        <w:t xml:space="preserve">259 of 278 live trades match a model trade; per-trade points correlate 0.99 and average execution slippage is only -0.6 pts per trade (-164 pts cumulative). Live is 44 pts behind the model in total.</w:t>
+        <w:t xml:space="preserve">259 of 278 live trades match a model trade; per-trade points correlate 0.99 and average execution difference is -1.2 pts per trade (-310 pts cumulative, of which -81 is one early exit on 2 Mar 2026). Live is 190 pts behind the model in total.</w:t>
       </w:r>
     </w:p>
     <w:p>
@@ -496,7 +496,7 @@
           <w:sz w:val="21"/>
           <w:szCs w:val="21"/>
         </w:rPr>
-        <w:t xml:space="preserve">11 date typos were corrected and 2 live trades have no exit date (Appendix A). The log's own cumulative columns were recomputed from Net Points because they do not tie out in places.</w:t>
+        <w:t xml:space="preserve">11 date typos were corrected and 2 live trades had no exit date (Appendix A). The 29 Apr 2026 24,300 PE trade, open in the log at -39.5 pts, was closed at the SSR model exit (-185 pts) as confirmed. The log's own cumulative columns were recomputed from Net Points because they do not tie out in places.</w:t>
       </w:r>
     </w:p>
     <w:p>
@@ -1647,7 +1647,7 @@
                 <w:sz w:val="18"/>
                 <w:szCs w:val="18"/>
               </w:rPr>
-              <w:t xml:space="preserve">-9,781</w:t>
+              <w:t xml:space="preserve">-9,927</w:t>
             </w:r>
           </w:p>
         </w:tc>
@@ -1680,7 +1680,7 @@
                 <w:sz w:val="18"/>
                 <w:szCs w:val="18"/>
               </w:rPr>
-              <w:t xml:space="preserve">-10,984</w:t>
+              <w:t xml:space="preserve">-11,129</w:t>
             </w:r>
           </w:p>
         </w:tc>
@@ -1814,7 +1814,7 @@
                 <w:sz w:val="18"/>
                 <w:szCs w:val="18"/>
               </w:rPr>
-              <w:t xml:space="preserve">1,044</w:t>
+              <w:t xml:space="preserve">898</w:t>
             </w:r>
           </w:p>
         </w:tc>
@@ -1846,7 +1846,7 @@
                 <w:sz w:val="18"/>
                 <w:szCs w:val="18"/>
               </w:rPr>
-              <w:t xml:space="preserve">577</w:t>
+              <w:t xml:space="preserve">431</w:t>
             </w:r>
           </w:p>
         </w:tc>
@@ -1982,7 +1982,7 @@
                 <w:sz w:val="18"/>
                 <w:szCs w:val="18"/>
               </w:rPr>
-              <w:t xml:space="preserve">0.90</w:t>
+              <w:t xml:space="preserve">0.92</w:t>
             </w:r>
           </w:p>
         </w:tc>
@@ -2015,7 +2015,7 @@
                 <w:sz w:val="18"/>
                 <w:szCs w:val="18"/>
               </w:rPr>
-              <w:t xml:space="preserve">0.95</w:t>
+              <w:t xml:space="preserve">0.96</w:t>
             </w:r>
           </w:p>
         </w:tc>
@@ -2149,7 +2149,7 @@
                 <w:sz w:val="18"/>
                 <w:szCs w:val="18"/>
               </w:rPr>
-              <w:t xml:space="preserve">1.11</w:t>
+              <w:t xml:space="preserve">1.09</w:t>
             </w:r>
           </w:p>
         </w:tc>
@@ -2181,7 +2181,7 @@
                 <w:sz w:val="18"/>
                 <w:szCs w:val="18"/>
               </w:rPr>
-              <w:t xml:space="preserve">1.05</w:t>
+              <w:t xml:space="preserve">1.04</w:t>
             </w:r>
           </w:p>
         </w:tc>
@@ -2484,7 +2484,7 @@
                 <w:sz w:val="18"/>
                 <w:szCs w:val="18"/>
               </w:rPr>
-              <w:t xml:space="preserve">-71</w:t>
+              <w:t xml:space="preserve">-72</w:t>
             </w:r>
           </w:p>
         </w:tc>
@@ -2516,7 +2516,7 @@
                 <w:sz w:val="18"/>
                 <w:szCs w:val="18"/>
               </w:rPr>
-              <w:t xml:space="preserve">-31</w:t>
+              <w:t xml:space="preserve">-32</w:t>
             </w:r>
           </w:p>
         </w:tc>
@@ -2652,7 +2652,7 @@
                 <w:sz w:val="18"/>
                 <w:szCs w:val="18"/>
               </w:rPr>
-              <w:t xml:space="preserve">3.75</w:t>
+              <w:t xml:space="preserve">3.23</w:t>
             </w:r>
           </w:p>
         </w:tc>
@@ -2685,7 +2685,7 @@
                 <w:sz w:val="18"/>
                 <w:szCs w:val="18"/>
               </w:rPr>
-              <w:t xml:space="preserve">1.08</w:t>
+              <w:t xml:space="preserve">0.81</w:t>
             </w:r>
           </w:p>
         </w:tc>
@@ -3154,7 +3154,7 @@
                 <w:sz w:val="18"/>
                 <w:szCs w:val="18"/>
               </w:rPr>
-              <w:t xml:space="preserve">58</w:t>
+              <w:t xml:space="preserve">50</w:t>
             </w:r>
           </w:p>
         </w:tc>
@@ -3186,7 +3186,7 @@
                 <w:sz w:val="18"/>
                 <w:szCs w:val="18"/>
               </w:rPr>
-              <w:t xml:space="preserve">32</w:t>
+              <w:t xml:space="preserve">24</w:t>
             </w:r>
           </w:p>
         </w:tc>
@@ -3657,7 +3657,7 @@
                 <w:sz w:val="18"/>
                 <w:szCs w:val="18"/>
               </w:rPr>
-              <w:t xml:space="preserve">0.73</w:t>
+              <w:t xml:space="preserve">0.63</w:t>
             </w:r>
           </w:p>
         </w:tc>
@@ -3690,7 +3690,7 @@
                 <w:sz w:val="18"/>
                 <w:szCs w:val="18"/>
               </w:rPr>
-              <w:t xml:space="preserve">0.50</w:t>
+              <w:t xml:space="preserve">0.37</w:t>
             </w:r>
           </w:p>
         </w:tc>
@@ -4191,7 +4191,7 @@
                 <w:sz w:val="18"/>
                 <w:szCs w:val="18"/>
               </w:rPr>
-              <w:t xml:space="preserve">13 of 18</w:t>
+              <w:t xml:space="preserve">12 of 18</w:t>
             </w:r>
           </w:p>
         </w:tc>
@@ -4592,7 +4592,7 @@
                 <w:sz w:val="18"/>
                 <w:szCs w:val="18"/>
               </w:rPr>
-              <w:t xml:space="preserve">58</w:t>
+              <w:t xml:space="preserve">50</w:t>
             </w:r>
           </w:p>
         </w:tc>
@@ -4624,7 +4624,7 @@
                 <w:sz w:val="18"/>
                 <w:szCs w:val="18"/>
               </w:rPr>
-              <w:t xml:space="preserve">32</w:t>
+              <w:t xml:space="preserve">24</w:t>
             </w:r>
           </w:p>
         </w:tc>
@@ -4656,7 +4656,7 @@
                 <w:sz w:val="18"/>
                 <w:szCs w:val="18"/>
               </w:rPr>
-              <w:t xml:space="preserve">37% | 21%</w:t>
+              <w:t xml:space="preserve">32% | 15%</w:t>
             </w:r>
           </w:p>
         </w:tc>
@@ -4790,7 +4790,7 @@
                 <w:sz w:val="18"/>
                 <w:szCs w:val="18"/>
               </w:rPr>
-              <w:t xml:space="preserve">0.73</w:t>
+              <w:t xml:space="preserve">0.63</w:t>
             </w:r>
           </w:p>
         </w:tc>
@@ -4823,7 +4823,7 @@
                 <w:sz w:val="18"/>
                 <w:szCs w:val="18"/>
               </w:rPr>
-              <w:t xml:space="preserve">0.50</w:t>
+              <w:t xml:space="preserve">0.37</w:t>
             </w:r>
           </w:p>
         </w:tc>
@@ -4856,7 +4856,7 @@
                 <w:sz w:val="18"/>
                 <w:szCs w:val="18"/>
               </w:rPr>
-              <w:t xml:space="preserve">5% | 4%</w:t>
+              <w:t xml:space="preserve">5% | 3%</w:t>
             </w:r>
           </w:p>
         </w:tc>
@@ -5384,7 +5384,7 @@
                 <w:sz w:val="18"/>
                 <w:szCs w:val="18"/>
               </w:rPr>
-              <w:t xml:space="preserve">-71</w:t>
+              <w:t xml:space="preserve">-72</w:t>
             </w:r>
           </w:p>
         </w:tc>
@@ -5416,7 +5416,7 @@
                 <w:sz w:val="18"/>
                 <w:szCs w:val="18"/>
               </w:rPr>
-              <w:t xml:space="preserve">-31</w:t>
+              <w:t xml:space="preserve">-32</w:t>
             </w:r>
           </w:p>
         </w:tc>
@@ -5448,7 +5448,7 @@
                 <w:sz w:val="18"/>
                 <w:szCs w:val="18"/>
               </w:rPr>
-              <w:t xml:space="preserve">273% | 120%</w:t>
+              <w:t xml:space="preserve">277% | 122%</w:t>
             </w:r>
           </w:p>
         </w:tc>
@@ -6097,7 +6097,7 @@
           <w:sz w:val="21"/>
           <w:szCs w:val="21"/>
         </w:rPr>
-        <w:t xml:space="preserve">Areas that are better: average winning trade is larger (77 vs 42 pts) and the longest losing streak is shorter (6-8 vs 11). But average loss size is almost 3x the backtest (71 vs 26 pts unhedged), which cancels the larger winners. Profit factor fell from 1.32 to about 1.1.</w:t>
+        <w:t xml:space="preserve">Areas that are better: average winning trade is larger (77 vs 42 pts) and the longest losing streak is shorter (6-8 vs 11). But average loss size is almost 3x the backtest (72 vs 26 pts unhedged), which cancels the larger winners. Profit factor fell from 1.32 to 1.09 (unhedged) and 1.04 (hedged).</w:t>
       </w:r>
     </w:p>
     <w:p>
@@ -6118,7 +6118,7 @@
           <w:sz w:val="21"/>
           <w:szCs w:val="21"/>
         </w:rPr>
-        <w:t xml:space="preserve">Live covers 18 months (about 15 trades a month, similar to the backtest's roughly 17 base trades a month) against about 67 months in the backtest, so one event such as 3 Feb 2026 weighs heavily. Still, the SSR model log, which is not affected by live execution, shows the same shortfall (61 pts a month, return / drawdown 0.92). Live months with a positive result: 13 of 18, in line with the model.</w:t>
+        <w:t xml:space="preserve">Live covers 18 months (about 15 trades a month, similar to the backtest's roughly 17 base trades a month) against about 67 months in the backtest, so one event such as 3 Feb 2026 weighs heavily. Still, the SSR model log, which is not affected by live execution, shows the same shortfall (61 pts a month, return / drawdown 0.92). Live months with a positive result: 13 of 18 unhedged and 12 of 18 hedged, against 13 of 18 for the model.</w:t>
       </w:r>
     </w:p>
     <w:p>
@@ -6475,7 +6475,7 @@
                 <w:sz w:val="18"/>
                 <w:szCs w:val="18"/>
               </w:rPr>
-              <w:t xml:space="preserve">1,044</w:t>
+              <w:t xml:space="preserve">898</w:t>
             </w:r>
           </w:p>
         </w:tc>
@@ -6507,7 +6507,7 @@
                 <w:sz w:val="18"/>
                 <w:szCs w:val="18"/>
               </w:rPr>
-              <w:t xml:space="preserve">577</w:t>
+              <w:t xml:space="preserve">431</w:t>
             </w:r>
           </w:p>
         </w:tc>
@@ -6741,7 +6741,7 @@
                 <w:sz w:val="18"/>
                 <w:szCs w:val="18"/>
               </w:rPr>
-              <w:t xml:space="preserve">0.73</w:t>
+              <w:t xml:space="preserve">0.63</w:t>
             </w:r>
           </w:p>
         </w:tc>
@@ -6773,7 +6773,7 @@
                 <w:sz w:val="18"/>
                 <w:szCs w:val="18"/>
               </w:rPr>
-              <w:t xml:space="preserve">0.50</w:t>
+              <w:t xml:space="preserve">0.37</w:t>
             </w:r>
           </w:p>
         </w:tc>
@@ -6805,7 +6805,7 @@
                 <w:sz w:val="18"/>
                 <w:szCs w:val="18"/>
               </w:rPr>
-              <w:t xml:space="preserve">-0.23</w:t>
+              <w:t xml:space="preserve">-0.26</w:t>
             </w:r>
           </w:p>
         </w:tc>
@@ -7007,7 +7007,7 @@
                 <w:sz w:val="18"/>
                 <w:szCs w:val="18"/>
               </w:rPr>
-              <w:t xml:space="preserve">58</w:t>
+              <w:t xml:space="preserve">50</w:t>
             </w:r>
           </w:p>
         </w:tc>
@@ -7039,7 +7039,7 @@
                 <w:sz w:val="18"/>
                 <w:szCs w:val="18"/>
               </w:rPr>
-              <w:t xml:space="preserve">32</w:t>
+              <w:t xml:space="preserve">24</w:t>
             </w:r>
           </w:p>
         </w:tc>
@@ -7140,7 +7140,7 @@
                 <w:sz w:val="18"/>
                 <w:szCs w:val="18"/>
               </w:rPr>
-              <w:t xml:space="preserve">1.11</w:t>
+              <w:t xml:space="preserve">1.09</w:t>
             </w:r>
           </w:p>
         </w:tc>
@@ -7173,7 +7173,7 @@
                 <w:sz w:val="18"/>
                 <w:szCs w:val="18"/>
               </w:rPr>
-              <w:t xml:space="preserve">1.05</w:t>
+              <w:t xml:space="preserve">1.04</w:t>
             </w:r>
           </w:p>
         </w:tc>
@@ -7206,7 +7206,7 @@
                 <w:sz w:val="18"/>
                 <w:szCs w:val="18"/>
               </w:rPr>
-              <w:t xml:space="preserve">-0.06</w:t>
+              <w:t xml:space="preserve">-0.05</w:t>
             </w:r>
           </w:p>
         </w:tc>
@@ -7501,7 +7501,7 @@
           <w:sz w:val="21"/>
           <w:szCs w:val="21"/>
         </w:rPr>
-        <w:t xml:space="preserve">unhedged +1,084 pts, max DD -1,422, return/DD 0.76; hedged +617 pts, max DD -1,155, return/DD 0.53; SSR model +1,063 pts, max DD -1,183, return/DD 0.90.</w:t>
+        <w:t xml:space="preserve">unhedged +939 pts, max DD -1,422, return/DD 0.66; hedged +471 pts, max DD -1,155, return/DD 0.41; SSR model +1,063 pts, max DD -1,183, return/DD 0.90.</w:t>
       </w:r>
     </w:p>
     <w:p>
@@ -8012,7 +8012,7 @@
                 <w:sz w:val="18"/>
                 <w:szCs w:val="18"/>
               </w:rPr>
-              <w:t xml:space="preserve">+1,044</w:t>
+              <w:t xml:space="preserve">+898</w:t>
             </w:r>
           </w:p>
         </w:tc>
@@ -8111,7 +8111,7 @@
                 <w:sz w:val="18"/>
                 <w:szCs w:val="18"/>
               </w:rPr>
-              <w:t xml:space="preserve">-44</w:t>
+              <w:t xml:space="preserve">-190</w:t>
             </w:r>
           </w:p>
         </w:tc>
@@ -8213,7 +8213,7 @@
                 <w:sz w:val="18"/>
                 <w:szCs w:val="18"/>
               </w:rPr>
-              <w:t xml:space="preserve">-164</w:t>
+              <w:t xml:space="preserve">-310</w:t>
             </w:r>
           </w:p>
         </w:tc>
@@ -8439,7 +8439,7 @@
           <w:sz w:val="21"/>
           <w:szCs w:val="21"/>
         </w:rPr>
-        <w:t xml:space="preserve">Execution: the average matched trade differs by -0.6 pts (median -0.5), 69% of matched trades are within 5 pts, and correlation of trade points is 0.99. Live is tracking the signal closely on the trades it takes.</w:t>
+        <w:t xml:space="preserve">Execution: the average matched trade differs by -1.2 pts (median -0.5), 69% of matched trades are within 5 pts, and correlation of trade points is 0.99. Live is tracking the signal closely on the trades it takes.</w:t>
       </w:r>
     </w:p>
     <w:p>
@@ -8456,7 +8456,7 @@
           <w:sz w:val="21"/>
           <w:szCs w:val="21"/>
         </w:rPr>
-        <w:t xml:space="preserve">Largest per-trade deviations: 2 Mar 2026 (live 185 vs model 266, exited 4 Mar rather than 10 Mar, -81), 30 Mar 2026 (-44), 29 Apr 2026 (live -39.5 vs model -185, +145, open trade with no exit logged), 24 Sep 2026 (+83).</w:t>
+        <w:t xml:space="preserve">Largest per-trade deviations: 2 Mar 2026 (live 185 vs model 266, exited 4 Mar rather than 10 Mar, -81), 30 Mar 2026 (-44), 2 May 2025 (-36), 24 Sep 2026 (+83: live held the short to 28 Sep and bought back at 7.6, while the model exited at 89 on 25 Sep).</w:t>
       </w:r>
     </w:p>
     <w:p>
@@ -11331,7 +11331,7 @@
                 <w:sz w:val="18"/>
                 <w:szCs w:val="18"/>
               </w:rPr>
-              <w:t xml:space="preserve">+321</w:t>
+              <w:t xml:space="preserve">+175</w:t>
             </w:r>
           </w:p>
         </w:tc>
@@ -11395,7 +11395,7 @@
                 <w:sz w:val="18"/>
                 <w:szCs w:val="18"/>
               </w:rPr>
-              <w:t xml:space="preserve">+59</w:t>
+              <w:t xml:space="preserve">-86</w:t>
             </w:r>
           </w:p>
         </w:tc>
@@ -11459,7 +11459,7 @@
                 <w:sz w:val="18"/>
                 <w:szCs w:val="18"/>
               </w:rPr>
-              <w:t xml:space="preserve">+206</w:t>
+              <w:t xml:space="preserve">+60</w:t>
             </w:r>
           </w:p>
         </w:tc>
@@ -13597,7 +13597,7 @@
           <w:sz w:val="21"/>
           <w:szCs w:val="21"/>
         </w:rPr>
-        <w:t xml:space="preserve">Live was 800+ pts below the model at the end of April 2026, recovering most of it by mid-May 2026 purely by sitting out the weak stretch. This is luck of timing, not a systematic edge, and should not be extrapolated.</w:t>
+        <w:t xml:space="preserve">Live was about 865 pts below the model on 28 Apr 2026 and had narrowed that to about 310 pts by 20 May 2026, purely by sitting out the weak stretch. This is luck of timing, not a systematic edge, and should not be extrapolated.</w:t>
       </w:r>
     </w:p>
     <w:p>
@@ -13631,7 +13631,7 @@
           <w:sz w:val="21"/>
           <w:szCs w:val="21"/>
         </w:rPr>
-        <w:t xml:space="preserve">The 30 Apr 2026 open trade (24,300 PE) was logged at -39.5 pts without an exit; the model closed the same trade at -185. If it was actually closed at the model level, live would be about 145 pts lower. Please confirm.</w:t>
+        <w:t xml:space="preserve">The 29 Apr 2026 trade (24,300 PE) was logged open at -39.5 pts with no exit. It has been closed at the model exit (-185 pts, exit 30 Apr) as confirmed, which lowers live results by 145 pts versus the earlier draft.</w:t>
       </w:r>
     </w:p>
     <w:p>
@@ -13670,7 +13670,7 @@
           <w:sz w:val="21"/>
           <w:szCs w:val="21"/>
         </w:rPr>
-        <w:t xml:space="preserve">At 37% (unhedged) and 21% (hedged) of the backtest's monthly point-rate, with return / drawdown of 0.7 and 0.5 versus 13.5, the live period is materially weaker. The model's own results over the same window are equally weak (61 pts a month, 0.92), so this is a signal-performance question rather than an execution one.</w:t>
+        <w:t xml:space="preserve">At 32% (unhedged) and 15% (hedged) of the backtest's monthly point-rate, with return / drawdown of 0.6 and 0.4 versus 13.5, the live period is materially weaker. The model's own results over the same window are equally weak (61 pts a month, 0.92), so this is a signal-performance question rather than an execution one.</w:t>
       </w:r>
     </w:p>
     <w:p>
@@ -13696,7 +13696,7 @@
           <w:sz w:val="21"/>
           <w:szCs w:val="21"/>
         </w:rPr>
-        <w:t xml:space="preserve">Live tracks the model with 0.99 correlation and about -0.6 pts a trade of slippage. The largest gaps come from unattended periods and a few discretionary strike or exit choices.</w:t>
+        <w:t xml:space="preserve">Live tracks the model with 0.99 correlation and about -1.2 pts a trade of difference. The largest gaps come from unattended periods and a few discretionary strike or exit choices.</w:t>
       </w:r>
     </w:p>
     <w:p>
@@ -13722,7 +13722,7 @@
           <w:sz w:val="21"/>
           <w:szCs w:val="21"/>
         </w:rPr>
-        <w:t xml:space="preserve">Loss size is the difference: average loss is 71 pts live versus 26 pts in the backtest, and one -798 pt trade equals roughly 2.5x the backtest worst case. Review stop / exit rules for expiry-day gaps.</w:t>
+        <w:t xml:space="preserve">Loss size is the difference: average loss is 72 pts live versus 26 pts in the backtest, and one -798 pt trade equals roughly 2.5x the backtest worst case. Review stop / exit rules for expiry-day gaps.</w:t>
       </w:r>
     </w:p>
     <w:p>
@@ -13859,7 +13859,24 @@
           <w:sz w:val="21"/>
           <w:szCs w:val="21"/>
         </w:rPr>
-        <w:t xml:space="preserve">live: exit date missing (open trade, -39.5 pts as logged; SSR exit was -185) (row 214): Exit NaT -&gt; 2026-04-30</w:t>
+        <w:t xml:space="preserve">live: exit date missing (open trade, closed at SSR exit) (row 214): Exit NaT -&gt; 2026-04-30</w:t>
+      </w:r>
+    </w:p>
+    <w:p>
+      <w:pPr>
+        <w:pStyle w:val="ListParagraph"/>
+        <w:numPr>
+          <w:ilvl w:val="0"/>
+          <w:numId w:val="2"/>
+        </w:numPr>
+        <w:spacing w:after="80"/>
+      </w:pPr>
+      <w:r>
+        <w:rPr>
+          <w:sz w:val="21"/>
+          <w:szCs w:val="21"/>
+        </w:rPr>
+        <w:t xml:space="preserve">live (row 214): open 24300 PE trade closed at model exit 388, net -39.5 -&gt; -185.0 pts (confirmed)</w:t>
       </w:r>
     </w:p>
     <w:p>

</xml_diff>

<commit_message>
Add slippage events and reasons section to evaluation report
Co-Authored-By: Claude Sonnet 5.5 <noreply@anthropic.com>
Claude-Session: https://claude.ai/code/session_01NXDNZiScC3GTCLADanc7h1
</commit_message>
<xml_diff>
--- a/analysis/SSR_Live_Performance_Evaluation.docx
+++ b/analysis/SSR_Live_Performance_Evaluation.docx
@@ -249,7 +249,7 @@
           <w:sz w:val="21"/>
           <w:szCs w:val="21"/>
         </w:rPr>
-        <w:t xml:space="preserve">259 of 278 live trades match a model trade; per-trade points correlate 0.99 and average execution difference is -1.2 pts per trade (-310 pts cumulative, of which -81 is one early exit on 2 Mar 2026). Live is 190 pts behind the model in total.</w:t>
+        <w:t xml:space="preserve">259 of 278 live trades match a model trade; per-trade points correlate 0.99 and average execution difference is -1.2 pts per trade (-310 pts cumulative, of which -81 is one early exit on 2 Mar 2026). Live is 190 pts behind the model in total. Named slippage events are listed in section 5.1.</w:t>
       </w:r>
     </w:p>
     <w:p>
@@ -8478,6 +8478,934 @@
     </w:p>
     <w:p>
       <w:pPr>
+        <w:pStyle w:val="Heading2"/>
+      </w:pPr>
+      <w:r>
+        <w:t xml:space="preserve">5.1 Slippage events and reasons</w:t>
+      </w:r>
+    </w:p>
+    <w:p>
+      <w:pPr>
+        <w:spacing w:after="120"/>
+      </w:pPr>
+      <w:r>
+        <w:rPr>
+          <w:sz w:val="21"/>
+          <w:szCs w:val="21"/>
+        </w:rPr>
+        <w:t xml:space="preserve">Four events were flagged with a reported slippage. The table sets the reported figure next to the difference the logs themselves show between the live trade and the matching SSR model trade (live points minus model points; negative means live was worse).</w:t>
+      </w:r>
+    </w:p>
+    <w:tbl>
+      <w:tblPr>
+        <w:tblW w:type="dxa" w:w="9906"/>
+        <w:tblBorders>
+          <w:top w:val="single" w:color="auto" w:sz="4"/>
+          <w:left w:val="single" w:color="auto" w:sz="4"/>
+          <w:bottom w:val="single" w:color="auto" w:sz="4"/>
+          <w:right w:val="single" w:color="auto" w:sz="4"/>
+          <w:insideH w:val="single" w:color="auto" w:sz="4"/>
+          <w:insideV w:val="single" w:color="auto" w:sz="4"/>
+        </w:tblBorders>
+      </w:tblPr>
+      <w:tblGrid>
+        <w:gridCol w:w="1400"/>
+        <w:gridCol w:w="3400"/>
+        <w:gridCol w:w="1500"/>
+        <w:gridCol w:w="1706"/>
+        <w:gridCol w:w="1900"/>
+      </w:tblGrid>
+      <w:tr>
+        <w:trPr>
+          <w:tblHeader/>
+        </w:trPr>
+        <w:tc>
+          <w:tcPr>
+            <w:tcW w:type="dxa" w:w="1400"/>
+            <w:tcBorders>
+              <w:top w:val="single" w:color="C9C8C0" w:sz="4"/>
+              <w:left w:val="single" w:color="C9C8C0" w:sz="4"/>
+              <w:bottom w:val="single" w:color="C9C8C0" w:sz="4"/>
+              <w:right w:val="single" w:color="C9C8C0" w:sz="4"/>
+            </w:tcBorders>
+            <w:shd w:fill="1F2A44" w:color="auto" w:val="clear"/>
+            <w:tcMar>
+              <w:top w:type="dxa" w:w="50"/>
+              <w:left w:type="dxa" w:w="90"/>
+              <w:bottom w:type="dxa" w:w="50"/>
+              <w:right w:type="dxa" w:w="90"/>
+            </w:tcMar>
+          </w:tcPr>
+          <w:p>
+            <w:pPr>
+              <w:jc w:val="left"/>
+            </w:pPr>
+            <w:r>
+              <w:rPr>
+                <w:b/>
+                <w:bCs/>
+                <w:color w:val="FFFFFF"/>
+                <w:sz w:val="18"/>
+                <w:szCs w:val="18"/>
+              </w:rPr>
+              <w:t xml:space="preserve">Date</w:t>
+            </w:r>
+          </w:p>
+        </w:tc>
+        <w:tc>
+          <w:tcPr>
+            <w:tcW w:type="dxa" w:w="3400"/>
+            <w:tcBorders>
+              <w:top w:val="single" w:color="C9C8C0" w:sz="4"/>
+              <w:left w:val="single" w:color="C9C8C0" w:sz="4"/>
+              <w:bottom w:val="single" w:color="C9C8C0" w:sz="4"/>
+              <w:right w:val="single" w:color="C9C8C0" w:sz="4"/>
+            </w:tcBorders>
+            <w:shd w:fill="1F2A44" w:color="auto" w:val="clear"/>
+            <w:tcMar>
+              <w:top w:type="dxa" w:w="50"/>
+              <w:left w:type="dxa" w:w="90"/>
+              <w:bottom w:type="dxa" w:w="50"/>
+              <w:right w:type="dxa" w:w="90"/>
+            </w:tcMar>
+          </w:tcPr>
+          <w:p>
+            <w:pPr>
+              <w:jc w:val="center"/>
+            </w:pPr>
+            <w:r>
+              <w:rPr>
+                <w:b/>
+                <w:bCs/>
+                <w:color w:val="FFFFFF"/>
+                <w:sz w:val="18"/>
+                <w:szCs w:val="18"/>
+              </w:rPr>
+              <w:t xml:space="preserve">Trade (short)</w:t>
+            </w:r>
+          </w:p>
+        </w:tc>
+        <w:tc>
+          <w:tcPr>
+            <w:tcW w:type="dxa" w:w="1500"/>
+            <w:tcBorders>
+              <w:top w:val="single" w:color="C9C8C0" w:sz="4"/>
+              <w:left w:val="single" w:color="C9C8C0" w:sz="4"/>
+              <w:bottom w:val="single" w:color="C9C8C0" w:sz="4"/>
+              <w:right w:val="single" w:color="C9C8C0" w:sz="4"/>
+            </w:tcBorders>
+            <w:shd w:fill="1F2A44" w:color="auto" w:val="clear"/>
+            <w:tcMar>
+              <w:top w:type="dxa" w:w="50"/>
+              <w:left w:type="dxa" w:w="90"/>
+              <w:bottom w:type="dxa" w:w="50"/>
+              <w:right w:type="dxa" w:w="90"/>
+            </w:tcMar>
+          </w:tcPr>
+          <w:p>
+            <w:pPr>
+              <w:jc w:val="center"/>
+            </w:pPr>
+            <w:r>
+              <w:rPr>
+                <w:b/>
+                <w:bCs/>
+                <w:color w:val="FFFFFF"/>
+                <w:sz w:val="18"/>
+                <w:szCs w:val="18"/>
+              </w:rPr>
+              <w:t xml:space="preserve">Reported slippage (pts)</w:t>
+            </w:r>
+          </w:p>
+        </w:tc>
+        <w:tc>
+          <w:tcPr>
+            <w:tcW w:type="dxa" w:w="1706"/>
+            <w:tcBorders>
+              <w:top w:val="single" w:color="C9C8C0" w:sz="4"/>
+              <w:left w:val="single" w:color="C9C8C0" w:sz="4"/>
+              <w:bottom w:val="single" w:color="C9C8C0" w:sz="4"/>
+              <w:right w:val="single" w:color="C9C8C0" w:sz="4"/>
+            </w:tcBorders>
+            <w:shd w:fill="1F2A44" w:color="auto" w:val="clear"/>
+            <w:tcMar>
+              <w:top w:type="dxa" w:w="50"/>
+              <w:left w:type="dxa" w:w="90"/>
+              <w:bottom w:type="dxa" w:w="50"/>
+              <w:right w:type="dxa" w:w="90"/>
+            </w:tcMar>
+          </w:tcPr>
+          <w:p>
+            <w:pPr>
+              <w:jc w:val="center"/>
+            </w:pPr>
+            <w:r>
+              <w:rPr>
+                <w:b/>
+                <w:bCs/>
+                <w:color w:val="FFFFFF"/>
+                <w:sz w:val="18"/>
+                <w:szCs w:val="18"/>
+              </w:rPr>
+              <w:t xml:space="preserve">Log-implied vs model (pts)</w:t>
+            </w:r>
+          </w:p>
+        </w:tc>
+        <w:tc>
+          <w:tcPr>
+            <w:tcW w:type="dxa" w:w="1900"/>
+            <w:tcBorders>
+              <w:top w:val="single" w:color="C9C8C0" w:sz="4"/>
+              <w:left w:val="single" w:color="C9C8C0" w:sz="4"/>
+              <w:bottom w:val="single" w:color="C9C8C0" w:sz="4"/>
+              <w:right w:val="single" w:color="C9C8C0" w:sz="4"/>
+            </w:tcBorders>
+            <w:shd w:fill="1F2A44" w:color="auto" w:val="clear"/>
+            <w:tcMar>
+              <w:top w:type="dxa" w:w="50"/>
+              <w:left w:type="dxa" w:w="90"/>
+              <w:bottom w:type="dxa" w:w="50"/>
+              <w:right w:type="dxa" w:w="90"/>
+            </w:tcMar>
+          </w:tcPr>
+          <w:p>
+            <w:pPr>
+              <w:jc w:val="center"/>
+            </w:pPr>
+            <w:r>
+              <w:rPr>
+                <w:b/>
+                <w:bCs/>
+                <w:color w:val="FFFFFF"/>
+                <w:sz w:val="18"/>
+                <w:szCs w:val="18"/>
+              </w:rPr>
+              <w:t xml:space="preserve">Reason</w:t>
+            </w:r>
+          </w:p>
+        </w:tc>
+      </w:tr>
+      <w:tr>
+        <w:trPr>
+          <w:cantSplit/>
+        </w:trPr>
+        <w:tc>
+          <w:tcPr>
+            <w:tcW w:type="dxa" w:w="1400"/>
+            <w:tcBorders>
+              <w:top w:val="single" w:color="C9C8C0" w:sz="4"/>
+              <w:left w:val="single" w:color="C9C8C0" w:sz="4"/>
+              <w:bottom w:val="single" w:color="C9C8C0" w:sz="4"/>
+              <w:right w:val="single" w:color="C9C8C0" w:sz="4"/>
+            </w:tcBorders>
+            <w:tcMar>
+              <w:top w:type="dxa" w:w="50"/>
+              <w:left w:type="dxa" w:w="90"/>
+              <w:bottom w:type="dxa" w:w="50"/>
+              <w:right w:type="dxa" w:w="90"/>
+            </w:tcMar>
+          </w:tcPr>
+          <w:p>
+            <w:pPr>
+              <w:jc w:val="left"/>
+            </w:pPr>
+            <w:r>
+              <w:rPr>
+                <w:color w:val="0B0B0B"/>
+                <w:sz w:val="18"/>
+                <w:szCs w:val="18"/>
+              </w:rPr>
+              <w:t xml:space="preserve">26 May 2025</w:t>
+            </w:r>
+          </w:p>
+        </w:tc>
+        <w:tc>
+          <w:tcPr>
+            <w:tcW w:type="dxa" w:w="3400"/>
+            <w:tcBorders>
+              <w:top w:val="single" w:color="C9C8C0" w:sz="4"/>
+              <w:left w:val="single" w:color="C9C8C0" w:sz="4"/>
+              <w:bottom w:val="single" w:color="C9C8C0" w:sz="4"/>
+              <w:right w:val="single" w:color="C9C8C0" w:sz="4"/>
+            </w:tcBorders>
+            <w:tcMar>
+              <w:top w:type="dxa" w:w="50"/>
+              <w:left w:type="dxa" w:w="90"/>
+              <w:bottom w:type="dxa" w:w="50"/>
+              <w:right w:type="dxa" w:w="90"/>
+            </w:tcMar>
+          </w:tcPr>
+          <w:p>
+            <w:pPr>
+              <w:jc w:val="center"/>
+            </w:pPr>
+            <w:r>
+              <w:rPr>
+                <w:b w:val="false"/>
+                <w:bCs w:val="false"/>
+                <w:color w:val="0B0B0B"/>
+                <w:sz w:val="18"/>
+                <w:szCs w:val="18"/>
+              </w:rPr>
+              <w:t xml:space="preserve">25,050 PE, exit 27 May (live -149.7 vs model -114)</w:t>
+            </w:r>
+          </w:p>
+        </w:tc>
+        <w:tc>
+          <w:tcPr>
+            <w:tcW w:type="dxa" w:w="1500"/>
+            <w:tcBorders>
+              <w:top w:val="single" w:color="C9C8C0" w:sz="4"/>
+              <w:left w:val="single" w:color="C9C8C0" w:sz="4"/>
+              <w:bottom w:val="single" w:color="C9C8C0" w:sz="4"/>
+              <w:right w:val="single" w:color="C9C8C0" w:sz="4"/>
+            </w:tcBorders>
+            <w:tcMar>
+              <w:top w:type="dxa" w:w="50"/>
+              <w:left w:type="dxa" w:w="90"/>
+              <w:bottom w:type="dxa" w:w="50"/>
+              <w:right w:type="dxa" w:w="90"/>
+            </w:tcMar>
+          </w:tcPr>
+          <w:p>
+            <w:pPr>
+              <w:jc w:val="center"/>
+            </w:pPr>
+            <w:r>
+              <w:rPr>
+                <w:b w:val="false"/>
+                <w:bCs w:val="false"/>
+                <w:color w:val="0B0B0B"/>
+                <w:sz w:val="18"/>
+                <w:szCs w:val="18"/>
+              </w:rPr>
+              <w:t xml:space="preserve">not stated</w:t>
+            </w:r>
+          </w:p>
+        </w:tc>
+        <w:tc>
+          <w:tcPr>
+            <w:tcW w:type="dxa" w:w="1706"/>
+            <w:tcBorders>
+              <w:top w:val="single" w:color="C9C8C0" w:sz="4"/>
+              <w:left w:val="single" w:color="C9C8C0" w:sz="4"/>
+              <w:bottom w:val="single" w:color="C9C8C0" w:sz="4"/>
+              <w:right w:val="single" w:color="C9C8C0" w:sz="4"/>
+            </w:tcBorders>
+            <w:tcMar>
+              <w:top w:type="dxa" w:w="50"/>
+              <w:left w:type="dxa" w:w="90"/>
+              <w:bottom w:type="dxa" w:w="50"/>
+              <w:right w:type="dxa" w:w="90"/>
+            </w:tcMar>
+          </w:tcPr>
+          <w:p>
+            <w:pPr>
+              <w:jc w:val="center"/>
+            </w:pPr>
+            <w:r>
+              <w:rPr>
+                <w:b w:val="false"/>
+                <w:bCs w:val="false"/>
+                <w:color w:val="0B0B0B"/>
+                <w:sz w:val="18"/>
+                <w:szCs w:val="18"/>
+              </w:rPr>
+              <w:t xml:space="preserve">-35.7</w:t>
+            </w:r>
+          </w:p>
+        </w:tc>
+        <w:tc>
+          <w:tcPr>
+            <w:tcW w:type="dxa" w:w="1900"/>
+            <w:tcBorders>
+              <w:top w:val="single" w:color="C9C8C0" w:sz="4"/>
+              <w:left w:val="single" w:color="C9C8C0" w:sz="4"/>
+              <w:bottom w:val="single" w:color="C9C8C0" w:sz="4"/>
+              <w:right w:val="single" w:color="C9C8C0" w:sz="4"/>
+            </w:tcBorders>
+            <w:tcMar>
+              <w:top w:type="dxa" w:w="50"/>
+              <w:left w:type="dxa" w:w="90"/>
+              <w:bottom w:type="dxa" w:w="50"/>
+              <w:right w:type="dxa" w:w="90"/>
+            </w:tcMar>
+          </w:tcPr>
+          <w:p>
+            <w:pPr>
+              <w:jc w:val="center"/>
+            </w:pPr>
+            <w:r>
+              <w:rPr>
+                <w:b w:val="false"/>
+                <w:bCs w:val="false"/>
+                <w:color w:val="0B0B0B"/>
+                <w:sz w:val="18"/>
+                <w:szCs w:val="18"/>
+              </w:rPr>
+              <w:t xml:space="preserve">CTCL issue</w:t>
+            </w:r>
+          </w:p>
+        </w:tc>
+      </w:tr>
+      <w:tr>
+        <w:trPr>
+          <w:cantSplit/>
+        </w:trPr>
+        <w:tc>
+          <w:tcPr>
+            <w:tcW w:type="dxa" w:w="1400"/>
+            <w:tcBorders>
+              <w:top w:val="single" w:color="C9C8C0" w:sz="4"/>
+              <w:left w:val="single" w:color="C9C8C0" w:sz="4"/>
+              <w:bottom w:val="single" w:color="C9C8C0" w:sz="4"/>
+              <w:right w:val="single" w:color="C9C8C0" w:sz="4"/>
+            </w:tcBorders>
+            <w:shd w:fill="F4F3EF" w:color="auto" w:val="clear"/>
+            <w:tcMar>
+              <w:top w:type="dxa" w:w="50"/>
+              <w:left w:type="dxa" w:w="90"/>
+              <w:bottom w:type="dxa" w:w="50"/>
+              <w:right w:type="dxa" w:w="90"/>
+            </w:tcMar>
+          </w:tcPr>
+          <w:p>
+            <w:pPr>
+              <w:jc w:val="left"/>
+            </w:pPr>
+            <w:r>
+              <w:rPr>
+                <w:color w:val="0B0B0B"/>
+                <w:sz w:val="18"/>
+                <w:szCs w:val="18"/>
+              </w:rPr>
+              <w:t xml:space="preserve">5 Jun 2025</w:t>
+            </w:r>
+          </w:p>
+        </w:tc>
+        <w:tc>
+          <w:tcPr>
+            <w:tcW w:type="dxa" w:w="3400"/>
+            <w:tcBorders>
+              <w:top w:val="single" w:color="C9C8C0" w:sz="4"/>
+              <w:left w:val="single" w:color="C9C8C0" w:sz="4"/>
+              <w:bottom w:val="single" w:color="C9C8C0" w:sz="4"/>
+              <w:right w:val="single" w:color="C9C8C0" w:sz="4"/>
+            </w:tcBorders>
+            <w:shd w:fill="F4F3EF" w:color="auto" w:val="clear"/>
+            <w:tcMar>
+              <w:top w:type="dxa" w:w="50"/>
+              <w:left w:type="dxa" w:w="90"/>
+              <w:bottom w:type="dxa" w:w="50"/>
+              <w:right w:type="dxa" w:w="90"/>
+            </w:tcMar>
+          </w:tcPr>
+          <w:p>
+            <w:pPr>
+              <w:jc w:val="center"/>
+            </w:pPr>
+            <w:r>
+              <w:rPr>
+                <w:b w:val="false"/>
+                <w:bCs w:val="false"/>
+                <w:color w:val="0B0B0B"/>
+                <w:sz w:val="18"/>
+                <w:szCs w:val="18"/>
+              </w:rPr>
+              <w:t xml:space="preserve">24,750 PE, same-day exit (live +41.9 vs model +50)</w:t>
+            </w:r>
+          </w:p>
+        </w:tc>
+        <w:tc>
+          <w:tcPr>
+            <w:tcW w:type="dxa" w:w="1500"/>
+            <w:tcBorders>
+              <w:top w:val="single" w:color="C9C8C0" w:sz="4"/>
+              <w:left w:val="single" w:color="C9C8C0" w:sz="4"/>
+              <w:bottom w:val="single" w:color="C9C8C0" w:sz="4"/>
+              <w:right w:val="single" w:color="C9C8C0" w:sz="4"/>
+            </w:tcBorders>
+            <w:shd w:fill="F4F3EF" w:color="auto" w:val="clear"/>
+            <w:tcMar>
+              <w:top w:type="dxa" w:w="50"/>
+              <w:left w:type="dxa" w:w="90"/>
+              <w:bottom w:type="dxa" w:w="50"/>
+              <w:right w:type="dxa" w:w="90"/>
+            </w:tcMar>
+          </w:tcPr>
+          <w:p>
+            <w:pPr>
+              <w:jc w:val="center"/>
+            </w:pPr>
+            <w:r>
+              <w:rPr>
+                <w:b w:val="false"/>
+                <w:bCs w:val="false"/>
+                <w:color w:val="0B0B0B"/>
+                <w:sz w:val="18"/>
+                <w:szCs w:val="18"/>
+              </w:rPr>
+              <w:t xml:space="preserve">8</w:t>
+            </w:r>
+          </w:p>
+        </w:tc>
+        <w:tc>
+          <w:tcPr>
+            <w:tcW w:type="dxa" w:w="1706"/>
+            <w:tcBorders>
+              <w:top w:val="single" w:color="C9C8C0" w:sz="4"/>
+              <w:left w:val="single" w:color="C9C8C0" w:sz="4"/>
+              <w:bottom w:val="single" w:color="C9C8C0" w:sz="4"/>
+              <w:right w:val="single" w:color="C9C8C0" w:sz="4"/>
+            </w:tcBorders>
+            <w:shd w:fill="F4F3EF" w:color="auto" w:val="clear"/>
+            <w:tcMar>
+              <w:top w:type="dxa" w:w="50"/>
+              <w:left w:type="dxa" w:w="90"/>
+              <w:bottom w:type="dxa" w:w="50"/>
+              <w:right w:type="dxa" w:w="90"/>
+            </w:tcMar>
+          </w:tcPr>
+          <w:p>
+            <w:pPr>
+              <w:jc w:val="center"/>
+            </w:pPr>
+            <w:r>
+              <w:rPr>
+                <w:b w:val="false"/>
+                <w:bCs w:val="false"/>
+                <w:color w:val="0B0B0B"/>
+                <w:sz w:val="18"/>
+                <w:szCs w:val="18"/>
+              </w:rPr>
+              <w:t xml:space="preserve">-8.1</w:t>
+            </w:r>
+          </w:p>
+        </w:tc>
+        <w:tc>
+          <w:tcPr>
+            <w:tcW w:type="dxa" w:w="1900"/>
+            <w:tcBorders>
+              <w:top w:val="single" w:color="C9C8C0" w:sz="4"/>
+              <w:left w:val="single" w:color="C9C8C0" w:sz="4"/>
+              <w:bottom w:val="single" w:color="C9C8C0" w:sz="4"/>
+              <w:right w:val="single" w:color="C9C8C0" w:sz="4"/>
+            </w:tcBorders>
+            <w:shd w:fill="F4F3EF" w:color="auto" w:val="clear"/>
+            <w:tcMar>
+              <w:top w:type="dxa" w:w="50"/>
+              <w:left w:type="dxa" w:w="90"/>
+              <w:bottom w:type="dxa" w:w="50"/>
+              <w:right w:type="dxa" w:w="90"/>
+            </w:tcMar>
+          </w:tcPr>
+          <w:p>
+            <w:pPr>
+              <w:jc w:val="center"/>
+            </w:pPr>
+            <w:r>
+              <w:rPr>
+                <w:b w:val="false"/>
+                <w:bCs w:val="false"/>
+                <w:color w:val="0B0B0B"/>
+                <w:sz w:val="18"/>
+                <w:szCs w:val="18"/>
+              </w:rPr>
+              <w:t xml:space="preserve">Slippage (reason not given)</w:t>
+            </w:r>
+          </w:p>
+        </w:tc>
+      </w:tr>
+      <w:tr>
+        <w:trPr>
+          <w:cantSplit/>
+        </w:trPr>
+        <w:tc>
+          <w:tcPr>
+            <w:tcW w:type="dxa" w:w="1400"/>
+            <w:tcBorders>
+              <w:top w:val="single" w:color="C9C8C0" w:sz="4"/>
+              <w:left w:val="single" w:color="C9C8C0" w:sz="4"/>
+              <w:bottom w:val="single" w:color="C9C8C0" w:sz="4"/>
+              <w:right w:val="single" w:color="C9C8C0" w:sz="4"/>
+            </w:tcBorders>
+            <w:tcMar>
+              <w:top w:type="dxa" w:w="50"/>
+              <w:left w:type="dxa" w:w="90"/>
+              <w:bottom w:type="dxa" w:w="50"/>
+              <w:right w:type="dxa" w:w="90"/>
+            </w:tcMar>
+          </w:tcPr>
+          <w:p>
+            <w:pPr>
+              <w:jc w:val="left"/>
+            </w:pPr>
+            <w:r>
+              <w:rPr>
+                <w:color w:val="0B0B0B"/>
+                <w:sz w:val="18"/>
+                <w:szCs w:val="18"/>
+              </w:rPr>
+              <w:t xml:space="preserve">3 Feb 2026</w:t>
+            </w:r>
+          </w:p>
+        </w:tc>
+        <w:tc>
+          <w:tcPr>
+            <w:tcW w:type="dxa" w:w="3400"/>
+            <w:tcBorders>
+              <w:top w:val="single" w:color="C9C8C0" w:sz="4"/>
+              <w:left w:val="single" w:color="C9C8C0" w:sz="4"/>
+              <w:bottom w:val="single" w:color="C9C8C0" w:sz="4"/>
+              <w:right w:val="single" w:color="C9C8C0" w:sz="4"/>
+            </w:tcBorders>
+            <w:tcMar>
+              <w:top w:type="dxa" w:w="50"/>
+              <w:left w:type="dxa" w:w="90"/>
+              <w:bottom w:type="dxa" w:w="50"/>
+              <w:right w:type="dxa" w:w="90"/>
+            </w:tcMar>
+          </w:tcPr>
+          <w:p>
+            <w:pPr>
+              <w:jc w:val="center"/>
+            </w:pPr>
+            <w:r>
+              <w:rPr>
+                <w:b w:val="false"/>
+                <w:bCs w:val="false"/>
+                <w:color w:val="0B0B0B"/>
+                <w:sz w:val="18"/>
+                <w:szCs w:val="18"/>
+              </w:rPr>
+              <w:t xml:space="preserve">24,950 CE, exit 3 Feb (live -797.8 vs model -768)</w:t>
+            </w:r>
+          </w:p>
+        </w:tc>
+        <w:tc>
+          <w:tcPr>
+            <w:tcW w:type="dxa" w:w="1500"/>
+            <w:tcBorders>
+              <w:top w:val="single" w:color="C9C8C0" w:sz="4"/>
+              <w:left w:val="single" w:color="C9C8C0" w:sz="4"/>
+              <w:bottom w:val="single" w:color="C9C8C0" w:sz="4"/>
+              <w:right w:val="single" w:color="C9C8C0" w:sz="4"/>
+            </w:tcBorders>
+            <w:tcMar>
+              <w:top w:type="dxa" w:w="50"/>
+              <w:left w:type="dxa" w:w="90"/>
+              <w:bottom w:type="dxa" w:w="50"/>
+              <w:right w:type="dxa" w:w="90"/>
+            </w:tcMar>
+          </w:tcPr>
+          <w:p>
+            <w:pPr>
+              <w:jc w:val="center"/>
+            </w:pPr>
+            <w:r>
+              <w:rPr>
+                <w:b w:val="false"/>
+                <w:bCs w:val="false"/>
+                <w:color w:val="0B0B0B"/>
+                <w:sz w:val="18"/>
+                <w:szCs w:val="18"/>
+              </w:rPr>
+              <w:t xml:space="preserve">27</w:t>
+            </w:r>
+          </w:p>
+        </w:tc>
+        <w:tc>
+          <w:tcPr>
+            <w:tcW w:type="dxa" w:w="1706"/>
+            <w:tcBorders>
+              <w:top w:val="single" w:color="C9C8C0" w:sz="4"/>
+              <w:left w:val="single" w:color="C9C8C0" w:sz="4"/>
+              <w:bottom w:val="single" w:color="C9C8C0" w:sz="4"/>
+              <w:right w:val="single" w:color="C9C8C0" w:sz="4"/>
+            </w:tcBorders>
+            <w:tcMar>
+              <w:top w:type="dxa" w:w="50"/>
+              <w:left w:type="dxa" w:w="90"/>
+              <w:bottom w:type="dxa" w:w="50"/>
+              <w:right w:type="dxa" w:w="90"/>
+            </w:tcMar>
+          </w:tcPr>
+          <w:p>
+            <w:pPr>
+              <w:jc w:val="center"/>
+            </w:pPr>
+            <w:r>
+              <w:rPr>
+                <w:b w:val="false"/>
+                <w:bCs w:val="false"/>
+                <w:color w:val="0B0B0B"/>
+                <w:sz w:val="18"/>
+                <w:szCs w:val="18"/>
+              </w:rPr>
+              <w:t xml:space="preserve">-29.8</w:t>
+            </w:r>
+          </w:p>
+        </w:tc>
+        <w:tc>
+          <w:tcPr>
+            <w:tcW w:type="dxa" w:w="1900"/>
+            <w:tcBorders>
+              <w:top w:val="single" w:color="C9C8C0" w:sz="4"/>
+              <w:left w:val="single" w:color="C9C8C0" w:sz="4"/>
+              <w:bottom w:val="single" w:color="C9C8C0" w:sz="4"/>
+              <w:right w:val="single" w:color="C9C8C0" w:sz="4"/>
+            </w:tcBorders>
+            <w:tcMar>
+              <w:top w:type="dxa" w:w="50"/>
+              <w:left w:type="dxa" w:w="90"/>
+              <w:bottom w:type="dxa" w:w="50"/>
+              <w:right w:type="dxa" w:w="90"/>
+            </w:tcMar>
+          </w:tcPr>
+          <w:p>
+            <w:pPr>
+              <w:jc w:val="center"/>
+            </w:pPr>
+            <w:r>
+              <w:rPr>
+                <w:b w:val="false"/>
+                <w:bCs w:val="false"/>
+                <w:color w:val="0B0B0B"/>
+                <w:sz w:val="18"/>
+                <w:szCs w:val="18"/>
+              </w:rPr>
+              <w:t xml:space="preserve">Manual exit</w:t>
+            </w:r>
+          </w:p>
+        </w:tc>
+      </w:tr>
+      <w:tr>
+        <w:trPr>
+          <w:cantSplit/>
+        </w:trPr>
+        <w:tc>
+          <w:tcPr>
+            <w:tcW w:type="dxa" w:w="1400"/>
+            <w:tcBorders>
+              <w:top w:val="single" w:color="C9C8C0" w:sz="4"/>
+              <w:left w:val="single" w:color="C9C8C0" w:sz="4"/>
+              <w:bottom w:val="single" w:color="C9C8C0" w:sz="4"/>
+              <w:right w:val="single" w:color="C9C8C0" w:sz="4"/>
+            </w:tcBorders>
+            <w:shd w:fill="F4F3EF" w:color="auto" w:val="clear"/>
+            <w:tcMar>
+              <w:top w:type="dxa" w:w="50"/>
+              <w:left w:type="dxa" w:w="90"/>
+              <w:bottom w:type="dxa" w:w="50"/>
+              <w:right w:type="dxa" w:w="90"/>
+            </w:tcMar>
+          </w:tcPr>
+          <w:p>
+            <w:pPr>
+              <w:jc w:val="left"/>
+            </w:pPr>
+            <w:r>
+              <w:rPr>
+                <w:color w:val="0B0B0B"/>
+                <w:sz w:val="18"/>
+                <w:szCs w:val="18"/>
+              </w:rPr>
+              <w:t xml:space="preserve">18 Aug 2026</w:t>
+            </w:r>
+          </w:p>
+        </w:tc>
+        <w:tc>
+          <w:tcPr>
+            <w:tcW w:type="dxa" w:w="3400"/>
+            <w:tcBorders>
+              <w:top w:val="single" w:color="C9C8C0" w:sz="4"/>
+              <w:left w:val="single" w:color="C9C8C0" w:sz="4"/>
+              <w:bottom w:val="single" w:color="C9C8C0" w:sz="4"/>
+              <w:right w:val="single" w:color="C9C8C0" w:sz="4"/>
+            </w:tcBorders>
+            <w:shd w:fill="F4F3EF" w:color="auto" w:val="clear"/>
+            <w:tcMar>
+              <w:top w:type="dxa" w:w="50"/>
+              <w:left w:type="dxa" w:w="90"/>
+              <w:bottom w:type="dxa" w:w="50"/>
+              <w:right w:type="dxa" w:w="90"/>
+            </w:tcMar>
+          </w:tcPr>
+          <w:p>
+            <w:pPr>
+              <w:jc w:val="center"/>
+            </w:pPr>
+            <w:r>
+              <w:rPr>
+                <w:b w:val="false"/>
+                <w:bCs w:val="false"/>
+                <w:color w:val="0B0B0B"/>
+                <w:sz w:val="18"/>
+                <w:szCs w:val="18"/>
+              </w:rPr>
+              <w:t xml:space="preserve">24,250 CE, same-day exit (live +28.6 vs model +30)</w:t>
+            </w:r>
+          </w:p>
+        </w:tc>
+        <w:tc>
+          <w:tcPr>
+            <w:tcW w:type="dxa" w:w="1500"/>
+            <w:tcBorders>
+              <w:top w:val="single" w:color="C9C8C0" w:sz="4"/>
+              <w:left w:val="single" w:color="C9C8C0" w:sz="4"/>
+              <w:bottom w:val="single" w:color="C9C8C0" w:sz="4"/>
+              <w:right w:val="single" w:color="C9C8C0" w:sz="4"/>
+            </w:tcBorders>
+            <w:shd w:fill="F4F3EF" w:color="auto" w:val="clear"/>
+            <w:tcMar>
+              <w:top w:type="dxa" w:w="50"/>
+              <w:left w:type="dxa" w:w="90"/>
+              <w:bottom w:type="dxa" w:w="50"/>
+              <w:right w:type="dxa" w:w="90"/>
+            </w:tcMar>
+          </w:tcPr>
+          <w:p>
+            <w:pPr>
+              <w:jc w:val="center"/>
+            </w:pPr>
+            <w:r>
+              <w:rPr>
+                <w:b w:val="false"/>
+                <w:bCs w:val="false"/>
+                <w:color w:val="0B0B0B"/>
+                <w:sz w:val="18"/>
+                <w:szCs w:val="18"/>
+              </w:rPr>
+              <w:t xml:space="preserve">50.3</w:t>
+            </w:r>
+          </w:p>
+        </w:tc>
+        <w:tc>
+          <w:tcPr>
+            <w:tcW w:type="dxa" w:w="1706"/>
+            <w:tcBorders>
+              <w:top w:val="single" w:color="C9C8C0" w:sz="4"/>
+              <w:left w:val="single" w:color="C9C8C0" w:sz="4"/>
+              <w:bottom w:val="single" w:color="C9C8C0" w:sz="4"/>
+              <w:right w:val="single" w:color="C9C8C0" w:sz="4"/>
+            </w:tcBorders>
+            <w:shd w:fill="F4F3EF" w:color="auto" w:val="clear"/>
+            <w:tcMar>
+              <w:top w:type="dxa" w:w="50"/>
+              <w:left w:type="dxa" w:w="90"/>
+              <w:bottom w:type="dxa" w:w="50"/>
+              <w:right w:type="dxa" w:w="90"/>
+            </w:tcMar>
+          </w:tcPr>
+          <w:p>
+            <w:pPr>
+              <w:jc w:val="center"/>
+            </w:pPr>
+            <w:r>
+              <w:rPr>
+                <w:b w:val="false"/>
+                <w:bCs w:val="false"/>
+                <w:color w:val="0B0B0B"/>
+                <w:sz w:val="18"/>
+                <w:szCs w:val="18"/>
+              </w:rPr>
+              <w:t xml:space="preserve">-1.4</w:t>
+            </w:r>
+          </w:p>
+        </w:tc>
+        <w:tc>
+          <w:tcPr>
+            <w:tcW w:type="dxa" w:w="1900"/>
+            <w:tcBorders>
+              <w:top w:val="single" w:color="C9C8C0" w:sz="4"/>
+              <w:left w:val="single" w:color="C9C8C0" w:sz="4"/>
+              <w:bottom w:val="single" w:color="C9C8C0" w:sz="4"/>
+              <w:right w:val="single" w:color="C9C8C0" w:sz="4"/>
+            </w:tcBorders>
+            <w:shd w:fill="F4F3EF" w:color="auto" w:val="clear"/>
+            <w:tcMar>
+              <w:top w:type="dxa" w:w="50"/>
+              <w:left w:type="dxa" w:w="90"/>
+              <w:bottom w:type="dxa" w:w="50"/>
+              <w:right w:type="dxa" w:w="90"/>
+            </w:tcMar>
+          </w:tcPr>
+          <w:p>
+            <w:pPr>
+              <w:jc w:val="center"/>
+            </w:pPr>
+            <w:r>
+              <w:rPr>
+                <w:b w:val="false"/>
+                <w:bCs w:val="false"/>
+                <w:color w:val="0B0B0B"/>
+                <w:sz w:val="18"/>
+                <w:szCs w:val="18"/>
+              </w:rPr>
+              <w:t xml:space="preserve">Reason not given</w:t>
+            </w:r>
+          </w:p>
+        </w:tc>
+      </w:tr>
+    </w:tbl>
+    <w:p>
+      <w:pPr>
+        <w:spacing w:after="120"/>
+      </w:pPr>
+    </w:p>
+    <w:p>
+      <w:pPr>
+        <w:pStyle w:val="ListParagraph"/>
+        <w:numPr>
+          <w:ilvl w:val="0"/>
+          <w:numId w:val="2"/>
+        </w:numPr>
+        <w:spacing w:after="80"/>
+      </w:pPr>
+      <w:r>
+        <w:rPr>
+          <w:sz w:val="21"/>
+          <w:szCs w:val="21"/>
+        </w:rPr>
+        <w:t xml:space="preserve">The first three events reconcile with the logs (reported 8 and 27 pts against -8.1 and -29.8). Together the 26 May 2025, 5 Jun 2025 and 3 Feb 2026 trades account for about -74 pts of the -310 pts cumulative execution difference; the rest is spread over many small differences plus the early exit on 2 Mar 2026 (-81 pts).</w:t>
+      </w:r>
+    </w:p>
+    <w:p>
+      <w:pPr>
+        <w:pStyle w:val="ListParagraph"/>
+        <w:numPr>
+          <w:ilvl w:val="0"/>
+          <w:numId w:val="2"/>
+        </w:numPr>
+        <w:spacing w:after="80"/>
+      </w:pPr>
+      <w:r>
+        <w:rPr>
+          <w:sz w:val="21"/>
+          <w:szCs w:val="21"/>
+        </w:rPr>
+        <w:t xml:space="preserve">The 3 Feb 2026 manual exit cost 27 pts on a trade that lost -798 pts, so the manual exit did not change the outcome of that tail event.</w:t>
+      </w:r>
+    </w:p>
+    <w:p>
+      <w:pPr>
+        <w:pStyle w:val="ListParagraph"/>
+        <w:numPr>
+          <w:ilvl w:val="0"/>
+          <w:numId w:val="2"/>
+        </w:numPr>
+        <w:spacing w:after="80"/>
+      </w:pPr>
+      <w:r>
+        <w:rPr>
+          <w:sz w:val="21"/>
+          <w:szCs w:val="21"/>
+        </w:rPr>
+        <w:t xml:space="preserve">The 18 Aug 2026 slippage of 50.3 pts is reported by the desk but is not visible in the trade logs: live and model differ by only -1.4 pts on that day, and the live log shows no trade with a 50-pt gap to the model. If it applies, the live log or the model log for that day needs checking (for example a different fill or trade not recorded).</w:t>
+      </w:r>
+    </w:p>
+    <w:p>
+      <w:pPr>
         <w:spacing w:after="60" w:before="120"/>
         <w:jc w:val="center"/>
       </w:pPr>
@@ -8667,7 +9595,7 @@
         <w:pStyle w:val="Heading2"/>
       </w:pPr>
       <w:r>
-        <w:t xml:space="preserve">5.1 Monthly points</w:t>
+        <w:t xml:space="preserve">5.2 Monthly points</w:t>
       </w:r>
     </w:p>
     <w:tbl>

</xml_diff>

<commit_message>
Add hedged result (-475) for Apr 30-May 24 2026 missed trades to analysis and report
Co-Authored-By: Claude Sonnet 5.5 <noreply@anthropic.com>
Claude-Session: https://claude.ai/code/session_01NXDNZiScC3GTCLADanc7h1
</commit_message>
<xml_diff>
--- a/analysis/SSR_Live_Performance_Evaluation.docx
+++ b/analysis/SSR_Live_Performance_Evaluation.docx
@@ -275,7 +275,7 @@
           <w:sz w:val="21"/>
           <w:szCs w:val="21"/>
         </w:rPr>
-        <w:t xml:space="preserve">Zubin's sabbatical leave for CFA (17 Jul - 2 Sep 2025 and 30 Apr - 24 May 2026) and discretionary shorts skipped (5 - 17 Mar 2026). The model made +155, +370 and -553 pts in those windows respectively, net -28 pts, so these gaps were close to neutral overall but concentrated risk in the timing (see section 6).</w:t>
+        <w:t xml:space="preserve">Zubin's sabbatical leave for CFA (17 Jul - 2 Sep 2025 and 30 Apr - 24 May 2026) and discretionary shorts skipped (5 - 17 Mar 2026). The model (unhedged) made +155, +370 and -553 pts in those windows respectively, net -28 pts. On a hedged basis the April - May 2026 window was -475 pts (the hedge adds +78), so the net becomes +50 pts. Either way the gaps were close to neutral overall but concentrated risk in the timing (see section 6).</w:t>
       </w:r>
     </w:p>
     <w:p>
@@ -13408,7 +13408,7 @@
           <w:sz w:val="21"/>
           <w:szCs w:val="21"/>
         </w:rPr>
-        <w:t xml:space="preserve">Three periods in the live log have no trades although the model kept signalling. They are flagged below with the reason supplied. Points are the SSR model result for trades that were not taken in the window.</w:t>
+        <w:t xml:space="preserve">Three periods in the live log have no trades although the model kept signalling. They are flagged below with the reason supplied. Points are the SSR model result for trades that were not taken in the window. For 30 Apr - 24 May 2026 the hedged result of those missed trades (-475 pts) was supplied; hedged figures for the other two windows are not available, so their unhedged values are used in the hedged total.</w:t>
       </w:r>
     </w:p>
     <w:tbl>
@@ -13424,12 +13424,13 @@
         </w:tblBorders>
       </w:tblPr>
       <w:tblGrid>
+        <w:gridCol w:w="1650"/>
         <w:gridCol w:w="1900"/>
-        <w:gridCol w:w="2200"/>
-        <w:gridCol w:w="1100"/>
-        <w:gridCol w:w="1000"/>
-        <w:gridCol w:w="1806"/>
-        <w:gridCol w:w="1900"/>
+        <w:gridCol w:w="900"/>
+        <w:gridCol w:w="800"/>
+        <w:gridCol w:w="1500"/>
+        <w:gridCol w:w="1500"/>
+        <w:gridCol w:w="1656"/>
       </w:tblGrid>
       <w:tr>
         <w:trPr>
@@ -13437,7 +13438,7 @@
         </w:trPr>
         <w:tc>
           <w:tcPr>
-            <w:tcW w:type="dxa" w:w="1900"/>
+            <w:tcW w:type="dxa" w:w="1650"/>
             <w:tcBorders>
               <w:top w:val="single" w:color="C9C8C0" w:sz="4"/>
               <w:left w:val="single" w:color="C9C8C0" w:sz="4"/>
@@ -13470,7 +13471,7 @@
         </w:tc>
         <w:tc>
           <w:tcPr>
-            <w:tcW w:type="dxa" w:w="2200"/>
+            <w:tcW w:type="dxa" w:w="1900"/>
             <w:tcBorders>
               <w:top w:val="single" w:color="C9C8C0" w:sz="4"/>
               <w:left w:val="single" w:color="C9C8C0" w:sz="4"/>
@@ -13503,7 +13504,7 @@
         </w:tc>
         <w:tc>
           <w:tcPr>
-            <w:tcW w:type="dxa" w:w="1100"/>
+            <w:tcW w:type="dxa" w:w="900"/>
             <w:tcBorders>
               <w:top w:val="single" w:color="C9C8C0" w:sz="4"/>
               <w:left w:val="single" w:color="C9C8C0" w:sz="4"/>
@@ -13536,7 +13537,7 @@
         </w:tc>
         <w:tc>
           <w:tcPr>
-            <w:tcW w:type="dxa" w:w="1000"/>
+            <w:tcW w:type="dxa" w:w="800"/>
             <w:tcBorders>
               <w:top w:val="single" w:color="C9C8C0" w:sz="4"/>
               <w:left w:val="single" w:color="C9C8C0" w:sz="4"/>
@@ -13569,7 +13570,7 @@
         </w:tc>
         <w:tc>
           <w:tcPr>
-            <w:tcW w:type="dxa" w:w="1806"/>
+            <w:tcW w:type="dxa" w:w="1500"/>
             <w:tcBorders>
               <w:top w:val="single" w:color="C9C8C0" w:sz="4"/>
               <w:left w:val="single" w:color="C9C8C0" w:sz="4"/>
@@ -13596,13 +13597,46 @@
                 <w:sz w:val="18"/>
                 <w:szCs w:val="18"/>
               </w:rPr>
-              <w:t xml:space="preserve">Model points not captured</w:t>
-            </w:r>
-          </w:p>
-        </w:tc>
-        <w:tc>
-          <w:tcPr>
-            <w:tcW w:type="dxa" w:w="1900"/>
+              <w:t xml:space="preserve">Model pts not captured (unhedged)</w:t>
+            </w:r>
+          </w:p>
+        </w:tc>
+        <w:tc>
+          <w:tcPr>
+            <w:tcW w:type="dxa" w:w="1500"/>
+            <w:tcBorders>
+              <w:top w:val="single" w:color="C9C8C0" w:sz="4"/>
+              <w:left w:val="single" w:color="C9C8C0" w:sz="4"/>
+              <w:bottom w:val="single" w:color="C9C8C0" w:sz="4"/>
+              <w:right w:val="single" w:color="C9C8C0" w:sz="4"/>
+            </w:tcBorders>
+            <w:shd w:fill="1F2A44" w:color="auto" w:val="clear"/>
+            <w:tcMar>
+              <w:top w:type="dxa" w:w="50"/>
+              <w:left w:type="dxa" w:w="90"/>
+              <w:bottom w:type="dxa" w:w="50"/>
+              <w:right w:type="dxa" w:w="90"/>
+            </w:tcMar>
+          </w:tcPr>
+          <w:p>
+            <w:pPr>
+              <w:jc w:val="center"/>
+            </w:pPr>
+            <w:r>
+              <w:rPr>
+                <w:b/>
+                <w:bCs/>
+                <w:color w:val="FFFFFF"/>
+                <w:sz w:val="18"/>
+                <w:szCs w:val="18"/>
+              </w:rPr>
+              <w:t xml:space="preserve">Model pts incl. hedge</w:t>
+            </w:r>
+          </w:p>
+        </w:tc>
+        <w:tc>
+          <w:tcPr>
+            <w:tcW w:type="dxa" w:w="1656"/>
             <w:tcBorders>
               <w:top w:val="single" w:color="C9C8C0" w:sz="4"/>
               <w:left w:val="single" w:color="C9C8C0" w:sz="4"/>
@@ -13640,6 +13674,36 @@
         </w:trPr>
         <w:tc>
           <w:tcPr>
+            <w:tcW w:type="dxa" w:w="1650"/>
+            <w:tcBorders>
+              <w:top w:val="single" w:color="C9C8C0" w:sz="4"/>
+              <w:left w:val="single" w:color="C9C8C0" w:sz="4"/>
+              <w:bottom w:val="single" w:color="C9C8C0" w:sz="4"/>
+              <w:right w:val="single" w:color="C9C8C0" w:sz="4"/>
+            </w:tcBorders>
+            <w:tcMar>
+              <w:top w:type="dxa" w:w="50"/>
+              <w:left w:type="dxa" w:w="90"/>
+              <w:bottom w:type="dxa" w:w="50"/>
+              <w:right w:type="dxa" w:w="90"/>
+            </w:tcMar>
+          </w:tcPr>
+          <w:p>
+            <w:pPr>
+              <w:jc w:val="left"/>
+            </w:pPr>
+            <w:r>
+              <w:rPr>
+                <w:color w:val="0B0B0B"/>
+                <w:sz w:val="18"/>
+                <w:szCs w:val="18"/>
+              </w:rPr>
+              <w:t xml:space="preserve">17 Jul - 2 Sep 2025</w:t>
+            </w:r>
+          </w:p>
+        </w:tc>
+        <w:tc>
+          <w:tcPr>
             <w:tcW w:type="dxa" w:w="1900"/>
             <w:tcBorders>
               <w:top w:val="single" w:color="C9C8C0" w:sz="4"/>
@@ -13656,36 +13720,6 @@
           </w:tcPr>
           <w:p>
             <w:pPr>
-              <w:jc w:val="left"/>
-            </w:pPr>
-            <w:r>
-              <w:rPr>
-                <w:color w:val="0B0B0B"/>
-                <w:sz w:val="18"/>
-                <w:szCs w:val="18"/>
-              </w:rPr>
-              <w:t xml:space="preserve">17 Jul - 2 Sep 2025</w:t>
-            </w:r>
-          </w:p>
-        </w:tc>
-        <w:tc>
-          <w:tcPr>
-            <w:tcW w:type="dxa" w:w="2200"/>
-            <w:tcBorders>
-              <w:top w:val="single" w:color="C9C8C0" w:sz="4"/>
-              <w:left w:val="single" w:color="C9C8C0" w:sz="4"/>
-              <w:bottom w:val="single" w:color="C9C8C0" w:sz="4"/>
-              <w:right w:val="single" w:color="C9C8C0" w:sz="4"/>
-            </w:tcBorders>
-            <w:tcMar>
-              <w:top w:type="dxa" w:w="50"/>
-              <w:left w:type="dxa" w:w="90"/>
-              <w:bottom w:type="dxa" w:w="50"/>
-              <w:right w:type="dxa" w:w="90"/>
-            </w:tcMar>
-          </w:tcPr>
-          <w:p>
-            <w:pPr>
               <w:jc w:val="center"/>
             </w:pPr>
             <w:r>
@@ -13702,7 +13736,7 @@
         </w:tc>
         <w:tc>
           <w:tcPr>
-            <w:tcW w:type="dxa" w:w="1100"/>
+            <w:tcW w:type="dxa" w:w="900"/>
             <w:tcBorders>
               <w:top w:val="single" w:color="C9C8C0" w:sz="4"/>
               <w:left w:val="single" w:color="C9C8C0" w:sz="4"/>
@@ -13734,7 +13768,7 @@
         </w:tc>
         <w:tc>
           <w:tcPr>
-            <w:tcW w:type="dxa" w:w="1000"/>
+            <w:tcW w:type="dxa" w:w="800"/>
             <w:tcBorders>
               <w:top w:val="single" w:color="C9C8C0" w:sz="4"/>
               <w:left w:val="single" w:color="C9C8C0" w:sz="4"/>
@@ -13766,7 +13800,7 @@
         </w:tc>
         <w:tc>
           <w:tcPr>
-            <w:tcW w:type="dxa" w:w="1806"/>
+            <w:tcW w:type="dxa" w:w="1500"/>
             <w:tcBorders>
               <w:top w:val="single" w:color="C9C8C0" w:sz="4"/>
               <w:left w:val="single" w:color="C9C8C0" w:sz="4"/>
@@ -13798,7 +13832,39 @@
         </w:tc>
         <w:tc>
           <w:tcPr>
-            <w:tcW w:type="dxa" w:w="1900"/>
+            <w:tcW w:type="dxa" w:w="1500"/>
+            <w:tcBorders>
+              <w:top w:val="single" w:color="C9C8C0" w:sz="4"/>
+              <w:left w:val="single" w:color="C9C8C0" w:sz="4"/>
+              <w:bottom w:val="single" w:color="C9C8C0" w:sz="4"/>
+              <w:right w:val="single" w:color="C9C8C0" w:sz="4"/>
+            </w:tcBorders>
+            <w:tcMar>
+              <w:top w:type="dxa" w:w="50"/>
+              <w:left w:type="dxa" w:w="90"/>
+              <w:bottom w:type="dxa" w:w="50"/>
+              <w:right w:type="dxa" w:w="90"/>
+            </w:tcMar>
+          </w:tcPr>
+          <w:p>
+            <w:pPr>
+              <w:jc w:val="center"/>
+            </w:pPr>
+            <w:r>
+              <w:rPr>
+                <w:b w:val="false"/>
+                <w:bCs w:val="false"/>
+                <w:color w:val="0B0B0B"/>
+                <w:sz w:val="18"/>
+                <w:szCs w:val="18"/>
+              </w:rPr>
+              <w:t xml:space="preserve">n/a (+155 used)</w:t>
+            </w:r>
+          </w:p>
+        </w:tc>
+        <w:tc>
+          <w:tcPr>
+            <w:tcW w:type="dxa" w:w="1656"/>
             <w:tcBorders>
               <w:top w:val="single" w:color="C9C8C0" w:sz="4"/>
               <w:left w:val="single" w:color="C9C8C0" w:sz="4"/>
@@ -13835,6 +13901,37 @@
         </w:trPr>
         <w:tc>
           <w:tcPr>
+            <w:tcW w:type="dxa" w:w="1650"/>
+            <w:tcBorders>
+              <w:top w:val="single" w:color="C9C8C0" w:sz="4"/>
+              <w:left w:val="single" w:color="C9C8C0" w:sz="4"/>
+              <w:bottom w:val="single" w:color="C9C8C0" w:sz="4"/>
+              <w:right w:val="single" w:color="C9C8C0" w:sz="4"/>
+            </w:tcBorders>
+            <w:shd w:fill="F4F3EF" w:color="auto" w:val="clear"/>
+            <w:tcMar>
+              <w:top w:type="dxa" w:w="50"/>
+              <w:left w:type="dxa" w:w="90"/>
+              <w:bottom w:type="dxa" w:w="50"/>
+              <w:right w:type="dxa" w:w="90"/>
+            </w:tcMar>
+          </w:tcPr>
+          <w:p>
+            <w:pPr>
+              <w:jc w:val="left"/>
+            </w:pPr>
+            <w:r>
+              <w:rPr>
+                <w:color w:val="0B0B0B"/>
+                <w:sz w:val="18"/>
+                <w:szCs w:val="18"/>
+              </w:rPr>
+              <w:t xml:space="preserve">5 - 17 Mar 2026</w:t>
+            </w:r>
+          </w:p>
+        </w:tc>
+        <w:tc>
+          <w:tcPr>
             <w:tcW w:type="dxa" w:w="1900"/>
             <w:tcBorders>
               <w:top w:val="single" w:color="C9C8C0" w:sz="4"/>
@@ -13852,37 +13949,6 @@
           </w:tcPr>
           <w:p>
             <w:pPr>
-              <w:jc w:val="left"/>
-            </w:pPr>
-            <w:r>
-              <w:rPr>
-                <w:color w:val="0B0B0B"/>
-                <w:sz w:val="18"/>
-                <w:szCs w:val="18"/>
-              </w:rPr>
-              <w:t xml:space="preserve">5 - 17 Mar 2026</w:t>
-            </w:r>
-          </w:p>
-        </w:tc>
-        <w:tc>
-          <w:tcPr>
-            <w:tcW w:type="dxa" w:w="2200"/>
-            <w:tcBorders>
-              <w:top w:val="single" w:color="C9C8C0" w:sz="4"/>
-              <w:left w:val="single" w:color="C9C8C0" w:sz="4"/>
-              <w:bottom w:val="single" w:color="C9C8C0" w:sz="4"/>
-              <w:right w:val="single" w:color="C9C8C0" w:sz="4"/>
-            </w:tcBorders>
-            <w:shd w:fill="F4F3EF" w:color="auto" w:val="clear"/>
-            <w:tcMar>
-              <w:top w:type="dxa" w:w="50"/>
-              <w:left w:type="dxa" w:w="90"/>
-              <w:bottom w:type="dxa" w:w="50"/>
-              <w:right w:type="dxa" w:w="90"/>
-            </w:tcMar>
-          </w:tcPr>
-          <w:p>
-            <w:pPr>
               <w:jc w:val="center"/>
             </w:pPr>
             <w:r>
@@ -13899,7 +13965,7 @@
         </w:tc>
         <w:tc>
           <w:tcPr>
-            <w:tcW w:type="dxa" w:w="1100"/>
+            <w:tcW w:type="dxa" w:w="900"/>
             <w:tcBorders>
               <w:top w:val="single" w:color="C9C8C0" w:sz="4"/>
               <w:left w:val="single" w:color="C9C8C0" w:sz="4"/>
@@ -13932,7 +13998,7 @@
         </w:tc>
         <w:tc>
           <w:tcPr>
-            <w:tcW w:type="dxa" w:w="1000"/>
+            <w:tcW w:type="dxa" w:w="800"/>
             <w:tcBorders>
               <w:top w:val="single" w:color="C9C8C0" w:sz="4"/>
               <w:left w:val="single" w:color="C9C8C0" w:sz="4"/>
@@ -13965,7 +14031,7 @@
         </w:tc>
         <w:tc>
           <w:tcPr>
-            <w:tcW w:type="dxa" w:w="1806"/>
+            <w:tcW w:type="dxa" w:w="1500"/>
             <w:tcBorders>
               <w:top w:val="single" w:color="C9C8C0" w:sz="4"/>
               <w:left w:val="single" w:color="C9C8C0" w:sz="4"/>
@@ -13998,7 +14064,40 @@
         </w:tc>
         <w:tc>
           <w:tcPr>
-            <w:tcW w:type="dxa" w:w="1900"/>
+            <w:tcW w:type="dxa" w:w="1500"/>
+            <w:tcBorders>
+              <w:top w:val="single" w:color="C9C8C0" w:sz="4"/>
+              <w:left w:val="single" w:color="C9C8C0" w:sz="4"/>
+              <w:bottom w:val="single" w:color="C9C8C0" w:sz="4"/>
+              <w:right w:val="single" w:color="C9C8C0" w:sz="4"/>
+            </w:tcBorders>
+            <w:shd w:fill="F4F3EF" w:color="auto" w:val="clear"/>
+            <w:tcMar>
+              <w:top w:type="dxa" w:w="50"/>
+              <w:left w:type="dxa" w:w="90"/>
+              <w:bottom w:type="dxa" w:w="50"/>
+              <w:right w:type="dxa" w:w="90"/>
+            </w:tcMar>
+          </w:tcPr>
+          <w:p>
+            <w:pPr>
+              <w:jc w:val="center"/>
+            </w:pPr>
+            <w:r>
+              <w:rPr>
+                <w:b w:val="false"/>
+                <w:bCs w:val="false"/>
+                <w:color w:val="0B0B0B"/>
+                <w:sz w:val="18"/>
+                <w:szCs w:val="18"/>
+              </w:rPr>
+              <w:t xml:space="preserve">n/a (+370 used)</w:t>
+            </w:r>
+          </w:p>
+        </w:tc>
+        <w:tc>
+          <w:tcPr>
+            <w:tcW w:type="dxa" w:w="1656"/>
             <w:tcBorders>
               <w:top w:val="single" w:color="C9C8C0" w:sz="4"/>
               <w:left w:val="single" w:color="C9C8C0" w:sz="4"/>
@@ -14036,6 +14135,36 @@
         </w:trPr>
         <w:tc>
           <w:tcPr>
+            <w:tcW w:type="dxa" w:w="1650"/>
+            <w:tcBorders>
+              <w:top w:val="single" w:color="C9C8C0" w:sz="4"/>
+              <w:left w:val="single" w:color="C9C8C0" w:sz="4"/>
+              <w:bottom w:val="single" w:color="C9C8C0" w:sz="4"/>
+              <w:right w:val="single" w:color="C9C8C0" w:sz="4"/>
+            </w:tcBorders>
+            <w:tcMar>
+              <w:top w:type="dxa" w:w="50"/>
+              <w:left w:type="dxa" w:w="90"/>
+              <w:bottom w:type="dxa" w:w="50"/>
+              <w:right w:type="dxa" w:w="90"/>
+            </w:tcMar>
+          </w:tcPr>
+          <w:p>
+            <w:pPr>
+              <w:jc w:val="left"/>
+            </w:pPr>
+            <w:r>
+              <w:rPr>
+                <w:color w:val="0B0B0B"/>
+                <w:sz w:val="18"/>
+                <w:szCs w:val="18"/>
+              </w:rPr>
+              <w:t xml:space="preserve">30 Apr - 24 May 2026</w:t>
+            </w:r>
+          </w:p>
+        </w:tc>
+        <w:tc>
+          <w:tcPr>
             <w:tcW w:type="dxa" w:w="1900"/>
             <w:tcBorders>
               <w:top w:val="single" w:color="C9C8C0" w:sz="4"/>
@@ -14052,36 +14181,6 @@
           </w:tcPr>
           <w:p>
             <w:pPr>
-              <w:jc w:val="left"/>
-            </w:pPr>
-            <w:r>
-              <w:rPr>
-                <w:color w:val="0B0B0B"/>
-                <w:sz w:val="18"/>
-                <w:szCs w:val="18"/>
-              </w:rPr>
-              <w:t xml:space="preserve">30 Apr - 24 May 2026</w:t>
-            </w:r>
-          </w:p>
-        </w:tc>
-        <w:tc>
-          <w:tcPr>
-            <w:tcW w:type="dxa" w:w="2200"/>
-            <w:tcBorders>
-              <w:top w:val="single" w:color="C9C8C0" w:sz="4"/>
-              <w:left w:val="single" w:color="C9C8C0" w:sz="4"/>
-              <w:bottom w:val="single" w:color="C9C8C0" w:sz="4"/>
-              <w:right w:val="single" w:color="C9C8C0" w:sz="4"/>
-            </w:tcBorders>
-            <w:tcMar>
-              <w:top w:type="dxa" w:w="50"/>
-              <w:left w:type="dxa" w:w="90"/>
-              <w:bottom w:type="dxa" w:w="50"/>
-              <w:right w:type="dxa" w:w="90"/>
-            </w:tcMar>
-          </w:tcPr>
-          <w:p>
-            <w:pPr>
               <w:jc w:val="center"/>
             </w:pPr>
             <w:r>
@@ -14098,7 +14197,7 @@
         </w:tc>
         <w:tc>
           <w:tcPr>
-            <w:tcW w:type="dxa" w:w="1100"/>
+            <w:tcW w:type="dxa" w:w="900"/>
             <w:tcBorders>
               <w:top w:val="single" w:color="C9C8C0" w:sz="4"/>
               <w:left w:val="single" w:color="C9C8C0" w:sz="4"/>
@@ -14130,7 +14229,7 @@
         </w:tc>
         <w:tc>
           <w:tcPr>
-            <w:tcW w:type="dxa" w:w="1000"/>
+            <w:tcW w:type="dxa" w:w="800"/>
             <w:tcBorders>
               <w:top w:val="single" w:color="C9C8C0" w:sz="4"/>
               <w:left w:val="single" w:color="C9C8C0" w:sz="4"/>
@@ -14162,7 +14261,7 @@
         </w:tc>
         <w:tc>
           <w:tcPr>
-            <w:tcW w:type="dxa" w:w="1806"/>
+            <w:tcW w:type="dxa" w:w="1500"/>
             <w:tcBorders>
               <w:top w:val="single" w:color="C9C8C0" w:sz="4"/>
               <w:left w:val="single" w:color="C9C8C0" w:sz="4"/>
@@ -14194,33 +14293,65 @@
         </w:tc>
         <w:tc>
           <w:tcPr>
-            <w:tcW w:type="dxa" w:w="1900"/>
-            <w:tcBorders>
-              <w:top w:val="single" w:color="C9C8C0" w:sz="4"/>
-              <w:left w:val="single" w:color="C9C8C0" w:sz="4"/>
-              <w:bottom w:val="single" w:color="C9C8C0" w:sz="4"/>
-              <w:right w:val="single" w:color="C9C8C0" w:sz="4"/>
-            </w:tcBorders>
-            <w:tcMar>
-              <w:top w:type="dxa" w:w="50"/>
-              <w:left w:type="dxa" w:w="90"/>
-              <w:bottom w:type="dxa" w:w="50"/>
-              <w:right w:type="dxa" w:w="90"/>
-            </w:tcMar>
-          </w:tcPr>
-          <w:p>
-            <w:pPr>
-              <w:jc w:val="center"/>
-            </w:pPr>
-            <w:r>
-              <w:rPr>
-                <w:b w:val="false"/>
-                <w:bCs w:val="false"/>
-                <w:color w:val="0B0B0B"/>
-                <w:sz w:val="18"/>
-                <w:szCs w:val="18"/>
-              </w:rPr>
-              <w:t xml:space="preserve">Avoided loss</w:t>
+            <w:tcW w:type="dxa" w:w="1500"/>
+            <w:tcBorders>
+              <w:top w:val="single" w:color="C9C8C0" w:sz="4"/>
+              <w:left w:val="single" w:color="C9C8C0" w:sz="4"/>
+              <w:bottom w:val="single" w:color="C9C8C0" w:sz="4"/>
+              <w:right w:val="single" w:color="C9C8C0" w:sz="4"/>
+            </w:tcBorders>
+            <w:tcMar>
+              <w:top w:type="dxa" w:w="50"/>
+              <w:left w:type="dxa" w:w="90"/>
+              <w:bottom w:type="dxa" w:w="50"/>
+              <w:right w:type="dxa" w:w="90"/>
+            </w:tcMar>
+          </w:tcPr>
+          <w:p>
+            <w:pPr>
+              <w:jc w:val="center"/>
+            </w:pPr>
+            <w:r>
+              <w:rPr>
+                <w:b w:val="false"/>
+                <w:bCs w:val="false"/>
+                <w:color w:val="0B0B0B"/>
+                <w:sz w:val="18"/>
+                <w:szCs w:val="18"/>
+              </w:rPr>
+              <w:t xml:space="preserve">-475</w:t>
+            </w:r>
+          </w:p>
+        </w:tc>
+        <w:tc>
+          <w:tcPr>
+            <w:tcW w:type="dxa" w:w="1656"/>
+            <w:tcBorders>
+              <w:top w:val="single" w:color="C9C8C0" w:sz="4"/>
+              <w:left w:val="single" w:color="C9C8C0" w:sz="4"/>
+              <w:bottom w:val="single" w:color="C9C8C0" w:sz="4"/>
+              <w:right w:val="single" w:color="C9C8C0" w:sz="4"/>
+            </w:tcBorders>
+            <w:tcMar>
+              <w:top w:type="dxa" w:w="50"/>
+              <w:left w:type="dxa" w:w="90"/>
+              <w:bottom w:type="dxa" w:w="50"/>
+              <w:right w:type="dxa" w:w="90"/>
+            </w:tcMar>
+          </w:tcPr>
+          <w:p>
+            <w:pPr>
+              <w:jc w:val="center"/>
+            </w:pPr>
+            <w:r>
+              <w:rPr>
+                <w:b w:val="false"/>
+                <w:bCs w:val="false"/>
+                <w:color w:val="0B0B0B"/>
+                <w:sz w:val="18"/>
+                <w:szCs w:val="18"/>
+              </w:rPr>
+              <w:t xml:space="preserve">Avoided loss (-553 unhedged, -475 hedged)</w:t>
             </w:r>
           </w:p>
         </w:tc>
@@ -14231,6 +14362,37 @@
         </w:trPr>
         <w:tc>
           <w:tcPr>
+            <w:tcW w:type="dxa" w:w="1650"/>
+            <w:tcBorders>
+              <w:top w:val="single" w:color="C9C8C0" w:sz="4"/>
+              <w:left w:val="single" w:color="C9C8C0" w:sz="4"/>
+              <w:bottom w:val="single" w:color="C9C8C0" w:sz="4"/>
+              <w:right w:val="single" w:color="C9C8C0" w:sz="4"/>
+            </w:tcBorders>
+            <w:shd w:fill="F4F3EF" w:color="auto" w:val="clear"/>
+            <w:tcMar>
+              <w:top w:type="dxa" w:w="50"/>
+              <w:left w:type="dxa" w:w="90"/>
+              <w:bottom w:type="dxa" w:w="50"/>
+              <w:right w:type="dxa" w:w="90"/>
+            </w:tcMar>
+          </w:tcPr>
+          <w:p>
+            <w:pPr>
+              <w:jc w:val="left"/>
+            </w:pPr>
+            <w:r>
+              <w:rPr>
+                <w:color w:val="0B0B0B"/>
+                <w:sz w:val="18"/>
+                <w:szCs w:val="18"/>
+              </w:rPr>
+              <w:t xml:space="preserve">Total</w:t>
+            </w:r>
+          </w:p>
+        </w:tc>
+        <w:tc>
+          <w:tcPr>
             <w:tcW w:type="dxa" w:w="1900"/>
             <w:tcBorders>
               <w:top w:val="single" w:color="C9C8C0" w:sz="4"/>
@@ -14248,37 +14410,6 @@
           </w:tcPr>
           <w:p>
             <w:pPr>
-              <w:jc w:val="left"/>
-            </w:pPr>
-            <w:r>
-              <w:rPr>
-                <w:color w:val="0B0B0B"/>
-                <w:sz w:val="18"/>
-                <w:szCs w:val="18"/>
-              </w:rPr>
-              <w:t xml:space="preserve">Total</w:t>
-            </w:r>
-          </w:p>
-        </w:tc>
-        <w:tc>
-          <w:tcPr>
-            <w:tcW w:type="dxa" w:w="2200"/>
-            <w:tcBorders>
-              <w:top w:val="single" w:color="C9C8C0" w:sz="4"/>
-              <w:left w:val="single" w:color="C9C8C0" w:sz="4"/>
-              <w:bottom w:val="single" w:color="C9C8C0" w:sz="4"/>
-              <w:right w:val="single" w:color="C9C8C0" w:sz="4"/>
-            </w:tcBorders>
-            <w:shd w:fill="F4F3EF" w:color="auto" w:val="clear"/>
-            <w:tcMar>
-              <w:top w:type="dxa" w:w="50"/>
-              <w:left w:type="dxa" w:w="90"/>
-              <w:bottom w:type="dxa" w:w="50"/>
-              <w:right w:type="dxa" w:w="90"/>
-            </w:tcMar>
-          </w:tcPr>
-          <w:p>
-            <w:pPr>
               <w:jc w:val="center"/>
             </w:pPr>
             <w:r>
@@ -14295,7 +14426,7 @@
         </w:tc>
         <w:tc>
           <w:tcPr>
-            <w:tcW w:type="dxa" w:w="1100"/>
+            <w:tcW w:type="dxa" w:w="900"/>
             <w:tcBorders>
               <w:top w:val="single" w:color="C9C8C0" w:sz="4"/>
               <w:left w:val="single" w:color="C9C8C0" w:sz="4"/>
@@ -14328,7 +14459,7 @@
         </w:tc>
         <w:tc>
           <w:tcPr>
-            <w:tcW w:type="dxa" w:w="1000"/>
+            <w:tcW w:type="dxa" w:w="800"/>
             <w:tcBorders>
               <w:top w:val="single" w:color="C9C8C0" w:sz="4"/>
               <w:left w:val="single" w:color="C9C8C0" w:sz="4"/>
@@ -14361,7 +14492,7 @@
         </w:tc>
         <w:tc>
           <w:tcPr>
-            <w:tcW w:type="dxa" w:w="1806"/>
+            <w:tcW w:type="dxa" w:w="1500"/>
             <w:tcBorders>
               <w:top w:val="single" w:color="C9C8C0" w:sz="4"/>
               <w:left w:val="single" w:color="C9C8C0" w:sz="4"/>
@@ -14394,7 +14525,40 @@
         </w:tc>
         <w:tc>
           <w:tcPr>
-            <w:tcW w:type="dxa" w:w="1900"/>
+            <w:tcW w:type="dxa" w:w="1500"/>
+            <w:tcBorders>
+              <w:top w:val="single" w:color="C9C8C0" w:sz="4"/>
+              <w:left w:val="single" w:color="C9C8C0" w:sz="4"/>
+              <w:bottom w:val="single" w:color="C9C8C0" w:sz="4"/>
+              <w:right w:val="single" w:color="C9C8C0" w:sz="4"/>
+            </w:tcBorders>
+            <w:shd w:fill="F4F3EF" w:color="auto" w:val="clear"/>
+            <w:tcMar>
+              <w:top w:type="dxa" w:w="50"/>
+              <w:left w:type="dxa" w:w="90"/>
+              <w:bottom w:type="dxa" w:w="50"/>
+              <w:right w:type="dxa" w:w="90"/>
+            </w:tcMar>
+          </w:tcPr>
+          <w:p>
+            <w:pPr>
+              <w:jc w:val="center"/>
+            </w:pPr>
+            <w:r>
+              <w:rPr>
+                <w:b w:val="false"/>
+                <w:bCs w:val="false"/>
+                <w:color w:val="0B0B0B"/>
+                <w:sz w:val="18"/>
+                <w:szCs w:val="18"/>
+              </w:rPr>
+              <w:t xml:space="preserve">+50</w:t>
+            </w:r>
+          </w:p>
+        </w:tc>
+        <w:tc>
+          <w:tcPr>
+            <w:tcW w:type="dxa" w:w="1656"/>
             <w:tcBorders>
               <w:top w:val="single" w:color="C9C8C0" w:sz="4"/>
               <w:left w:val="single" w:color="C9C8C0" w:sz="4"/>
@@ -14508,7 +14672,24 @@
           <w:sz w:val="21"/>
           <w:szCs w:val="21"/>
         </w:rPr>
-        <w:t xml:space="preserve">Net effect is only -28 model points, so the gaps did not change the overall result materially. Their effect on the path was large: the missed March 2026 rally in the model (+370 pts in four trades, all winners) coincided with the deepest live drawdown, and the pause from 30 Apr avoided a -553 pt stretch in which only 4 of 17 model trades won.</w:t>
+        <w:t xml:space="preserve">Net effect is only -28 model points unhedged (+50 on a hedged basis), so the gaps did not change the overall result materially. Their effect on the path was large: the missed March 2026 rally in the model (+370 pts in four trades, all winners) coincided with the deepest live drawdown, and the pause from 30 Apr avoided a stretch in which only 4 of 17 model trades won: -553 pts unhedged, or -475 pts once the hedge is included (the hedge would have recovered 78 pts of it).</w:t>
+      </w:r>
+    </w:p>
+    <w:p>
+      <w:pPr>
+        <w:pStyle w:val="ListParagraph"/>
+        <w:numPr>
+          <w:ilvl w:val="0"/>
+          <w:numId w:val="2"/>
+        </w:numPr>
+        <w:spacing w:after="80"/>
+      </w:pPr>
+      <w:r>
+        <w:rPr>
+          <w:sz w:val="21"/>
+          <w:szCs w:val="21"/>
+        </w:rPr>
+        <w:t xml:space="preserve">Indicative effect of the gaps: had live also traded all three windows, unhedged live would be about 870 pts (898 - 28) and hedged live about 481 pts (431 + 50). The hedge effect is known only for the April - May 2026 window, so the hedged figure is approximate. The live hedge log itself holds just two legs in that window (30 Apr and 4 May, about +17 pts raw), which are already inside the live hedged result.</w:t>
       </w:r>
     </w:p>
     <w:p>
@@ -14542,7 +14723,7 @@
           <w:sz w:val="21"/>
           <w:szCs w:val="21"/>
         </w:rPr>
-        <w:t xml:space="preserve">Sabbatical periods leave the strategy unattended and exposed to whichever regime follows; the July - September 2025 gap missed +155 pts and the April - May 2026 gap avoided -553 pts, opposite results from the same cause.</w:t>
+        <w:t xml:space="preserve">Sabbatical periods leave the strategy unattended and exposed to whichever regime follows; the July - September 2025 gap missed +155 pts and the April - May 2026 gap avoided -553 pts (-475 with hedge), opposite results from the same cause.</w:t>
       </w:r>
     </w:p>
     <w:p>

</xml_diff>